<commit_message>
Add service filters and sorting
</commit_message>
<xml_diff>
--- a/综合课设的另外四份报告/103 D 猫咖点单系统结项报告.docx
+++ b/综合课设的另外四份报告/103 D 猫咖点单系统结项报告.docx
@@ -13,7 +13,6 @@
           <w:noProof/>
           <w:color w:val="000000"/>
           <w:sz w:val="20"/>
-          <w:lang w:val="en-US" w:eastAsia="zh-CN"/>
         </w:rPr>
         <w:drawing>
           <wp:anchor distT="0" distB="0" distL="114300" distR="114300" simplePos="0" relativeHeight="251657216" behindDoc="0" locked="0" layoutInCell="1" allowOverlap="1" wp14:anchorId="0E4BE634" wp14:editId="1AC105A4">
@@ -75,7 +74,6 @@
                       <w:p>
                         <w:pPr>
                           <w:rPr>
-                            <w:rFonts w:hint="eastAsia"/>
                             <w:sz w:val="18"/>
                           </w:rPr>
                         </w:pPr>
@@ -166,7 +164,7 @@
                                           </a:ext>
                                         </a:extLst>
                                       </a:blip>
-                                      <a:srcRect l="35.098%" t="37.941%" r="33.015%" b="50.214%"/>
+                                      <a:srcRect l="35.098%" t="37.94%" r="33.015%" b="50.214%"/>
                                       <a:stretch>
                                         <a:fillRect/>
                                       </a:stretch>
@@ -254,19 +252,18 @@
         <w:spacing w:after="6pt"/>
         <w:jc w:val="center"/>
         <w:rPr>
-          <w:rFonts w:hint="eastAsia"/>
-          <w:color w:val="000000"/>
-          <w:sz w:val="44"/>
-          <w:lang w:val="en-US" w:eastAsia="zh-CN"/>
-        </w:rPr>
-      </w:pPr>
-      <w:r>
-        <w:rPr>
-          <w:rFonts w:hint="eastAsia"/>
           <w:color w:val="000000"/>
           <w:sz w:val="44"/>
           <w:lang w:eastAsia="zh-CN"/>
         </w:rPr>
+      </w:pPr>
+      <w:r>
+        <w:rPr>
+          <w:rFonts w:hint="eastAsia"/>
+          <w:color w:val="000000"/>
+          <w:sz w:val="44"/>
+          <w:lang w:eastAsia="zh-CN"/>
+        </w:rPr>
         <w:t>猫咖点单系统</w:t>
       </w:r>
       <w:r>
@@ -274,7 +271,7 @@
           <w:rFonts w:hint="eastAsia"/>
           <w:color w:val="000000"/>
           <w:sz w:val="44"/>
-          <w:lang w:val="en-US" w:eastAsia="zh-CN"/>
+          <w:lang w:eastAsia="zh-CN"/>
         </w:rPr>
         <w:t xml:space="preserve"> </w:t>
       </w:r>
@@ -285,10 +282,9 @@
         <w:spacing w:after="6pt"/>
         <w:jc w:val="center"/>
         <w:rPr>
-          <w:rFonts w:hint="eastAsia"/>
           <w:color w:val="000000"/>
           <w:sz w:val="28"/>
-          <w:lang w:val="en-US" w:eastAsia="zh-CN"/>
+          <w:lang w:eastAsia="zh-CN"/>
         </w:rPr>
       </w:pPr>
     </w:p>
@@ -300,7 +296,7 @@
         <w:rPr>
           <w:color w:val="000000"/>
           <w:sz w:val="44"/>
-          <w:lang w:val="en-US" w:eastAsia="zh-CN"/>
+          <w:lang w:eastAsia="zh-CN"/>
         </w:rPr>
       </w:pPr>
       <w:r>
@@ -308,7 +304,7 @@
           <w:rFonts w:hint="eastAsia"/>
           <w:color w:val="000000"/>
           <w:sz w:val="44"/>
-          <w:lang w:val="en-US" w:eastAsia="zh-CN"/>
+          <w:lang w:eastAsia="zh-CN"/>
         </w:rPr>
         <w:t>结项报告</w:t>
       </w:r>
@@ -323,15 +319,13 @@
     <w:p>
       <w:pPr>
         <w:rPr>
-          <w:rFonts w:hint="eastAsia"/>
           <w:color w:val="000000"/>
         </w:rPr>
       </w:pPr>
     </w:p>
     <w:tbl>
       <w:tblPr>
-        <w:tblW w:w="0pt" w:type="auto"/>
-        <w:tblInd w:w="0pt" w:type="dxa"/>
+        <w:tblW w:w="0pt" w:type="dxa"/>
         <w:tblBorders>
           <w:top w:val="single" w:sz="4" w:space="0" w:color="auto"/>
           <w:start w:val="single" w:sz="4" w:space="0" w:color="auto"/>
@@ -360,7 +354,6 @@
             <w:pPr>
               <w:jc w:val="center"/>
               <w:rPr>
-                <w:rFonts w:hint="eastAsia"/>
                 <w:color w:val="000000"/>
               </w:rPr>
             </w:pPr>
@@ -380,7 +373,6 @@
           <w:p>
             <w:pPr>
               <w:rPr>
-                <w:rFonts w:hint="eastAsia"/>
                 <w:color w:val="000000"/>
               </w:rPr>
             </w:pPr>
@@ -436,7 +428,6 @@
             <w:pPr>
               <w:jc w:val="center"/>
               <w:rPr>
-                <w:rFonts w:hint="eastAsia"/>
                 <w:color w:val="000000"/>
               </w:rPr>
             </w:pPr>
@@ -483,7 +474,6 @@
             <w:pPr>
               <w:jc w:val="center"/>
               <w:rPr>
-                <w:rFonts w:hint="eastAsia"/>
                 <w:color w:val="000000"/>
               </w:rPr>
             </w:pPr>
@@ -503,7 +493,6 @@
           <w:p>
             <w:pPr>
               <w:rPr>
-                <w:rFonts w:hint="eastAsia"/>
                 <w:color w:val="000000"/>
               </w:rPr>
             </w:pPr>
@@ -512,7 +501,7 @@
                 <w:rFonts w:hint="eastAsia"/>
                 <w:color w:val="000000"/>
               </w:rPr>
-              <w:t>Company-Project-PCM-REVIEW</w:t>
+              <w:t>CatCafe-Project-PCM-REVIEW</w:t>
             </w:r>
           </w:p>
         </w:tc>
@@ -531,7 +520,6 @@
             <w:pPr>
               <w:jc w:val="center"/>
               <w:rPr>
-                <w:rFonts w:hint="eastAsia"/>
                 <w:color w:val="000000"/>
               </w:rPr>
             </w:pPr>
@@ -551,7 +539,6 @@
           <w:p>
             <w:pPr>
               <w:rPr>
-                <w:rFonts w:hint="eastAsia"/>
                 <w:color w:val="000000"/>
               </w:rPr>
             </w:pPr>
@@ -571,7 +558,6 @@
             <w:pPr>
               <w:jc w:val="center"/>
               <w:rPr>
-                <w:rFonts w:hint="eastAsia"/>
                 <w:color w:val="000000"/>
               </w:rPr>
             </w:pPr>
@@ -597,58 +583,9 @@
             <w:r>
               <w:rPr>
                 <w:rFonts w:hint="eastAsia"/>
-                <w:sz w:val="24"/>
-                <w:u w:val="single"/>
-              </w:rPr>
-              <w:t>刘祖铭</w:t>
-            </w:r>
-            <w:r>
-              <w:rPr>
-                <w:rFonts w:hint="eastAsia"/>
-                <w:sz w:val="24"/>
-                <w:u w:val="single"/>
-              </w:rPr>
-              <w:t xml:space="preserve"> </w:t>
-            </w:r>
-            <w:r>
-              <w:rPr>
-                <w:rFonts w:hint="eastAsia"/>
-                <w:sz w:val="24"/>
-                <w:u w:val="single"/>
-              </w:rPr>
-              <w:t>石家桢</w:t>
-            </w:r>
-            <w:r>
-              <w:rPr>
-                <w:rFonts w:hint="eastAsia"/>
-                <w:sz w:val="24"/>
-                <w:u w:val="single"/>
-              </w:rPr>
-              <w:t xml:space="preserve"> </w:t>
-            </w:r>
-            <w:r>
-              <w:rPr>
-                <w:rFonts w:hint="eastAsia"/>
-                <w:sz w:val="24"/>
-                <w:u w:val="single"/>
+                <w:color w:val="000000"/>
               </w:rPr>
               <w:t>杨文轩</w:t>
-            </w:r>
-            <w:r>
-              <w:rPr>
-                <w:rFonts w:hint="eastAsia"/>
-                <w:sz w:val="24"/>
-                <w:u w:val="single"/>
-              </w:rPr>
-              <w:t xml:space="preserve"> </w:t>
-            </w:r>
-            <w:r>
-              <w:rPr>
-                <w:rFonts w:hint="eastAsia"/>
-                <w:sz w:val="24"/>
-                <w:u w:val="single"/>
-              </w:rPr>
-              <w:t>陈际宇</w:t>
             </w:r>
           </w:p>
         </w:tc>
@@ -667,7 +604,6 @@
             <w:pPr>
               <w:jc w:val="center"/>
               <w:rPr>
-                <w:rFonts w:hint="eastAsia"/>
                 <w:color w:val="000000"/>
               </w:rPr>
             </w:pPr>
@@ -687,7 +623,6 @@
           <w:p>
             <w:pPr>
               <w:rPr>
-                <w:rFonts w:hint="eastAsia"/>
                 <w:color w:val="000000"/>
               </w:rPr>
             </w:pPr>
@@ -735,7 +670,6 @@
             <w:pPr>
               <w:jc w:val="center"/>
               <w:rPr>
-                <w:rFonts w:hint="eastAsia"/>
                 <w:color w:val="000000"/>
               </w:rPr>
             </w:pPr>
@@ -755,7 +689,6 @@
           <w:p>
             <w:pPr>
               <w:rPr>
-                <w:rFonts w:hint="eastAsia"/>
                 <w:color w:val="000000"/>
               </w:rPr>
             </w:pPr>
@@ -803,7 +736,6 @@
             <w:pPr>
               <w:jc w:val="center"/>
               <w:rPr>
-                <w:rFonts w:hint="eastAsia"/>
                 <w:color w:val="000000"/>
               </w:rPr>
             </w:pPr>
@@ -877,7 +809,6 @@
         <w:pStyle w:val="a8"/>
         <w:jc w:val="both"/>
         <w:rPr>
-          <w:rFonts w:hint="eastAsia"/>
           <w:color w:val="000000"/>
           <w:sz w:val="21"/>
         </w:rPr>
@@ -896,7 +827,6 @@
           <w:noProof/>
           <w:color w:val="000000"/>
           <w:sz w:val="20"/>
-          <w:lang w:val="en-US" w:eastAsia="zh-CN"/>
         </w:rPr>
         <w:drawing>
           <wp:anchor distT="0" distB="0" distL="114300" distR="114300" simplePos="0" relativeHeight="251658240" behindDoc="0" locked="0" layoutInCell="1" allowOverlap="1" wp14:anchorId="10CB10DE" wp14:editId="2E0F2CD7">
@@ -953,9 +883,6 @@
                       <w:p>
                         <w:pPr>
                           <w:jc w:val="center"/>
-                          <w:rPr>
-                            <w:rFonts w:hint="eastAsia"/>
-                          </w:rPr>
                         </w:pPr>
                       </w:p>
                       <w:p>
@@ -1020,7 +947,7 @@
         <w:pageBreakBefore/>
         <w:jc w:val="center"/>
         <w:rPr>
-          <w:rFonts w:ascii="Times" w:hAnsi="Times" w:hint="eastAsia"/>
+          <w:rFonts w:ascii="Times" w:hAnsi="Times"/>
           <w:color w:val="000000"/>
           <w:sz w:val="32"/>
           <w:bdr w:val="single" w:sz="4" w:space="0" w:color="auto"/>
@@ -1097,7 +1024,6 @@
           <w:bCs w:val="0"/>
           <w:caps w:val="0"/>
           <w:sz w:val="22"/>
-          <w:lang w:val="en-US" w:eastAsia="zh-CN"/>
         </w:rPr>
       </w:pPr>
       <w:r>
@@ -1123,7 +1049,6 @@
           <w:rPr>
             <w:rStyle w:val="ab"/>
             <w:rFonts w:hint="eastAsia"/>
-            <w:lang w:val="en-US" w:eastAsia="zh-CN"/>
           </w:rPr>
           <w:t xml:space="preserve">1. </w:t>
         </w:r>
@@ -1131,61 +1056,53 @@
           <w:rPr>
             <w:rStyle w:val="ab"/>
             <w:rFonts w:hint="eastAsia"/>
-            <w:lang w:val="en-US" w:eastAsia="zh-CN"/>
           </w:rPr>
           <w:t>项目综合评估</w:t>
         </w:r>
         <w:r>
           <w:rPr>
             <w:rFonts w:hint="eastAsia"/>
-            <w:lang w:val="en-US" w:eastAsia="zh-CN"/>
           </w:rPr>
           <w:tab/>
         </w:r>
         <w:r>
           <w:rPr>
             <w:rFonts w:hint="eastAsia"/>
-            <w:lang w:val="en-US" w:eastAsia="zh-CN"/>
           </w:rPr>
           <w:fldChar w:fldCharType="begin"/>
         </w:r>
         <w:r>
           <w:rPr>
             <w:rFonts w:hint="eastAsia"/>
-            <w:lang w:val="en-US" w:eastAsia="zh-CN"/>
           </w:rPr>
           <w:instrText xml:space="preserve"> </w:instrText>
         </w:r>
         <w:r>
-          <w:rPr>
-            <w:lang w:val="en-US" w:eastAsia="zh-CN"/>
-          </w:rPr>
           <w:instrText>PAGEREF _Toc228739357 \h</w:instrText>
         </w:r>
         <w:r>
           <w:rPr>
             <w:rFonts w:hint="eastAsia"/>
-            <w:lang w:val="en-US" w:eastAsia="zh-CN"/>
           </w:rPr>
           <w:instrText xml:space="preserve"> </w:instrText>
         </w:r>
         <w:r>
           <w:rPr>
             <w:rFonts w:hint="eastAsia"/>
-            <w:lang w:val="en-US" w:eastAsia="zh-CN"/>
+          </w:rPr>
+        </w:r>
+        <w:r>
+          <w:rPr>
+            <w:rFonts w:hint="eastAsia"/>
           </w:rPr>
           <w:fldChar w:fldCharType="separate"/>
         </w:r>
         <w:r>
-          <w:rPr>
-            <w:lang w:val="en-US" w:eastAsia="zh-CN"/>
-          </w:rPr>
           <w:t>3</w:t>
         </w:r>
         <w:r>
           <w:rPr>
             <w:rFonts w:hint="eastAsia"/>
-            <w:lang w:val="en-US" w:eastAsia="zh-CN"/>
           </w:rPr>
           <w:fldChar w:fldCharType="end"/>
         </w:r>
@@ -1201,7 +1118,6 @@
           <w:rFonts w:ascii="等线" w:eastAsia="等线" w:hAnsi="等线" w:hint="eastAsia"/>
           <w:smallCaps w:val="0"/>
           <w:sz w:val="22"/>
-          <w:lang w:val="en-US" w:eastAsia="zh-CN"/>
         </w:rPr>
       </w:pPr>
       <w:hyperlink w:anchor="_Toc228739358" w:history="1">
@@ -1209,7 +1125,6 @@
           <w:rPr>
             <w:rStyle w:val="ab"/>
             <w:rFonts w:hint="eastAsia"/>
-            <w:lang w:val="en-US" w:eastAsia="zh-CN"/>
           </w:rPr>
           <w:t xml:space="preserve">1.1 </w:t>
         </w:r>
@@ -1217,61 +1132,53 @@
           <w:rPr>
             <w:rStyle w:val="ab"/>
             <w:rFonts w:hint="eastAsia"/>
-            <w:lang w:val="en-US" w:eastAsia="zh-CN"/>
           </w:rPr>
           <w:t>项目完成情况评估</w:t>
         </w:r>
         <w:r>
           <w:rPr>
             <w:rFonts w:hint="eastAsia"/>
-            <w:lang w:val="en-US" w:eastAsia="zh-CN"/>
           </w:rPr>
           <w:tab/>
         </w:r>
         <w:r>
           <w:rPr>
             <w:rFonts w:hint="eastAsia"/>
-            <w:lang w:val="en-US" w:eastAsia="zh-CN"/>
           </w:rPr>
           <w:fldChar w:fldCharType="begin"/>
         </w:r>
         <w:r>
           <w:rPr>
             <w:rFonts w:hint="eastAsia"/>
-            <w:lang w:val="en-US" w:eastAsia="zh-CN"/>
           </w:rPr>
           <w:instrText xml:space="preserve"> </w:instrText>
         </w:r>
         <w:r>
-          <w:rPr>
-            <w:lang w:val="en-US" w:eastAsia="zh-CN"/>
-          </w:rPr>
           <w:instrText>PAGEREF _Toc228739358 \h</w:instrText>
         </w:r>
         <w:r>
           <w:rPr>
             <w:rFonts w:hint="eastAsia"/>
-            <w:lang w:val="en-US" w:eastAsia="zh-CN"/>
           </w:rPr>
           <w:instrText xml:space="preserve"> </w:instrText>
         </w:r>
         <w:r>
           <w:rPr>
             <w:rFonts w:hint="eastAsia"/>
-            <w:lang w:val="en-US" w:eastAsia="zh-CN"/>
+          </w:rPr>
+        </w:r>
+        <w:r>
+          <w:rPr>
+            <w:rFonts w:hint="eastAsia"/>
           </w:rPr>
           <w:fldChar w:fldCharType="separate"/>
         </w:r>
         <w:r>
-          <w:rPr>
-            <w:lang w:val="en-US" w:eastAsia="zh-CN"/>
-          </w:rPr>
           <w:t>3</w:t>
         </w:r>
         <w:r>
           <w:rPr>
             <w:rFonts w:hint="eastAsia"/>
-            <w:lang w:val="en-US" w:eastAsia="zh-CN"/>
           </w:rPr>
           <w:fldChar w:fldCharType="end"/>
         </w:r>
@@ -1287,7 +1194,6 @@
           <w:rFonts w:ascii="等线" w:eastAsia="等线" w:hAnsi="等线" w:hint="eastAsia"/>
           <w:smallCaps w:val="0"/>
           <w:sz w:val="22"/>
-          <w:lang w:val="en-US" w:eastAsia="zh-CN"/>
         </w:rPr>
       </w:pPr>
       <w:hyperlink w:anchor="_Toc228739359" w:history="1">
@@ -1295,7 +1201,6 @@
           <w:rPr>
             <w:rStyle w:val="ab"/>
             <w:rFonts w:hint="eastAsia"/>
-            <w:lang w:val="en-US" w:eastAsia="zh-CN"/>
           </w:rPr>
           <w:t xml:space="preserve">1.2 </w:t>
         </w:r>
@@ -1303,21 +1208,14 @@
           <w:rPr>
             <w:rStyle w:val="ab"/>
             <w:rFonts w:hint="eastAsia"/>
-            <w:lang w:val="en-US" w:eastAsia="zh-CN"/>
           </w:rPr>
           <w:t>项目质量评估</w:t>
         </w:r>
         <w:r>
           <w:rPr>
             <w:rFonts w:hint="eastAsia"/>
-            <w:lang w:val="en-US" w:eastAsia="zh-CN"/>
           </w:rPr>
           <w:tab/>
-        </w:r>
-        <w:r>
-          <w:rPr>
-            <w:rFonts w:hint="eastAsia"/>
-          </w:rPr>
           <w:t>4</w:t>
         </w:r>
       </w:hyperlink>
@@ -1332,7 +1230,6 @@
           <w:rFonts w:ascii="等线" w:eastAsia="等线" w:hAnsi="等线" w:hint="eastAsia"/>
           <w:smallCaps w:val="0"/>
           <w:sz w:val="22"/>
-          <w:lang w:val="en-US" w:eastAsia="zh-CN"/>
         </w:rPr>
       </w:pPr>
       <w:hyperlink w:anchor="_Toc228739360" w:history="1">
@@ -1340,7 +1237,6 @@
           <w:rPr>
             <w:rStyle w:val="ab"/>
             <w:rFonts w:hint="eastAsia"/>
-            <w:lang w:val="en-US" w:eastAsia="zh-CN"/>
           </w:rPr>
           <w:t xml:space="preserve">1.3 </w:t>
         </w:r>
@@ -1348,21 +1244,14 @@
           <w:rPr>
             <w:rStyle w:val="ab"/>
             <w:rFonts w:hint="eastAsia"/>
-            <w:lang w:val="en-US" w:eastAsia="zh-CN"/>
           </w:rPr>
           <w:t>项目的市场价值</w:t>
         </w:r>
         <w:r>
           <w:rPr>
             <w:rFonts w:hint="eastAsia"/>
-            <w:lang w:val="en-US" w:eastAsia="zh-CN"/>
           </w:rPr>
           <w:tab/>
-        </w:r>
-        <w:r>
-          <w:rPr>
-            <w:rFonts w:hint="eastAsia"/>
-          </w:rPr>
           <w:t>5</w:t>
         </w:r>
       </w:hyperlink>
@@ -1377,7 +1266,6 @@
           <w:rFonts w:ascii="等线" w:eastAsia="等线" w:hAnsi="等线" w:hint="eastAsia"/>
           <w:smallCaps w:val="0"/>
           <w:sz w:val="22"/>
-          <w:lang w:val="en-US" w:eastAsia="zh-CN"/>
         </w:rPr>
       </w:pPr>
       <w:hyperlink w:anchor="_Toc228739361" w:history="1">
@@ -1385,7 +1273,6 @@
           <w:rPr>
             <w:rStyle w:val="ab"/>
             <w:rFonts w:hint="eastAsia"/>
-            <w:lang w:val="en-US" w:eastAsia="zh-CN"/>
           </w:rPr>
           <w:t xml:space="preserve">1.4 </w:t>
         </w:r>
@@ -1393,21 +1280,14 @@
           <w:rPr>
             <w:rStyle w:val="ab"/>
             <w:rFonts w:hint="eastAsia"/>
-            <w:lang w:val="en-US" w:eastAsia="zh-CN"/>
           </w:rPr>
           <w:t>项目开发来带的个人成长</w:t>
         </w:r>
         <w:r>
           <w:rPr>
             <w:rFonts w:hint="eastAsia"/>
-            <w:lang w:val="en-US" w:eastAsia="zh-CN"/>
           </w:rPr>
           <w:tab/>
-        </w:r>
-        <w:r>
-          <w:rPr>
-            <w:rFonts w:hint="eastAsia"/>
-          </w:rPr>
           <w:t>6</w:t>
         </w:r>
       </w:hyperlink>
@@ -1424,7 +1304,6 @@
           <w:bCs w:val="0"/>
           <w:caps w:val="0"/>
           <w:sz w:val="22"/>
-          <w:lang w:val="en-US" w:eastAsia="zh-CN"/>
         </w:rPr>
       </w:pPr>
       <w:hyperlink w:anchor="_Toc228739362" w:history="1">
@@ -1432,7 +1311,6 @@
           <w:rPr>
             <w:rStyle w:val="ab"/>
             <w:rFonts w:hint="eastAsia"/>
-            <w:lang w:val="en-US" w:eastAsia="zh-CN"/>
           </w:rPr>
           <w:t xml:space="preserve">2. </w:t>
         </w:r>
@@ -1440,21 +1318,14 @@
           <w:rPr>
             <w:rStyle w:val="ab"/>
             <w:rFonts w:hint="eastAsia"/>
-            <w:lang w:val="en-US" w:eastAsia="zh-CN"/>
           </w:rPr>
           <w:t>经验教训总结</w:t>
         </w:r>
         <w:r>
           <w:rPr>
             <w:rFonts w:hint="eastAsia"/>
-            <w:lang w:val="en-US" w:eastAsia="zh-CN"/>
           </w:rPr>
           <w:tab/>
-        </w:r>
-        <w:r>
-          <w:rPr>
-            <w:rFonts w:hint="eastAsia"/>
-          </w:rPr>
           <w:t>7</w:t>
         </w:r>
       </w:hyperlink>
@@ -1464,7 +1335,6 @@
         <w:pStyle w:val="1"/>
         <w:spacing w:before="8.75pt" w:after="8.75pt"/>
         <w:rPr>
-          <w:rFonts w:hint="eastAsia"/>
           <w:color w:val="000000"/>
         </w:rPr>
       </w:pPr>
@@ -1507,9 +1377,6 @@
     <w:p>
       <w:pPr>
         <w:ind w:firstLine="21pt"/>
-        <w:rPr>
-          <w:rFonts w:hint="eastAsia"/>
-        </w:rPr>
       </w:pPr>
       <w:r>
         <w:rPr>
@@ -1580,7 +1447,19 @@
         <w:rPr>
           <w:rFonts w:hint="eastAsia"/>
         </w:rPr>
-        <w:t xml:space="preserve"> 39 </w:t>
+        <w:t xml:space="preserve"> </w:t>
+      </w:r>
+      <w:r>
+        <w:rPr>
+          <w:rFonts w:hint="eastAsia"/>
+        </w:rPr>
+        <w:t>42</w:t>
+      </w:r>
+      <w:r>
+        <w:rPr>
+          <w:rFonts w:hint="eastAsia"/>
+        </w:rPr>
+        <w:t xml:space="preserve"> </w:t>
       </w:r>
       <w:r>
         <w:rPr>
@@ -1622,7 +1501,19 @@
         <w:rPr>
           <w:rFonts w:hint="eastAsia"/>
         </w:rPr>
-        <w:t>客户端完成用户端闭环流程。数据库</w:t>
+        <w:t>客户端完成用户端</w:t>
+      </w:r>
+      <w:r>
+        <w:rPr>
+          <w:rFonts w:hint="eastAsia"/>
+        </w:rPr>
+        <w:t>和管理端</w:t>
+      </w:r>
+      <w:r>
+        <w:rPr>
+          <w:rFonts w:hint="eastAsia"/>
+        </w:rPr>
+        <w:t>闭环流程。数据库</w:t>
       </w:r>
       <w:r>
         <w:rPr>
@@ -1682,8 +1573,7 @@
     </w:p>
     <w:tbl>
       <w:tblPr>
-        <w:tblW w:w="0pt" w:type="auto"/>
-        <w:tblInd w:w="0pt" w:type="dxa"/>
+        <w:tblW w:w="424.70pt" w:type="dxa"/>
         <w:tblBorders>
           <w:top w:val="single" w:sz="4" w:space="0" w:color="auto"/>
           <w:start w:val="single" w:sz="4" w:space="0" w:color="auto"/>
@@ -1701,14 +1591,13 @@
       <w:tr>
         <w:tc>
           <w:tcPr>
-            <w:tcW w:w="218pt" w:type="dxa"/>
+            <w:tcW w:w="210.95pt" w:type="dxa"/>
             <w:shd w:val="clear" w:color="auto" w:fill="D9D9D9"/>
           </w:tcPr>
           <w:p>
             <w:pPr>
               <w:jc w:val="center"/>
               <w:rPr>
-                <w:rFonts w:hint="eastAsia"/>
                 <w:color w:val="000000"/>
                 <w:sz w:val="18"/>
               </w:rPr>
@@ -1725,14 +1614,13 @@
         </w:tc>
         <w:tc>
           <w:tcPr>
-            <w:tcW w:w="218pt" w:type="dxa"/>
+            <w:tcW w:w="213.75pt" w:type="dxa"/>
             <w:shd w:val="clear" w:color="auto" w:fill="D9D9D9"/>
           </w:tcPr>
           <w:p>
             <w:pPr>
               <w:jc w:val="center"/>
               <w:rPr>
-                <w:rFonts w:hint="eastAsia"/>
                 <w:color w:val="000000"/>
                 <w:sz w:val="18"/>
               </w:rPr>
@@ -1751,12 +1639,11 @@
       <w:tr>
         <w:tc>
           <w:tcPr>
-            <w:tcW w:w="218pt" w:type="dxa"/>
+            <w:tcW w:w="210.95pt" w:type="dxa"/>
           </w:tcPr>
           <w:p>
             <w:pPr>
               <w:rPr>
-                <w:rFonts w:hint="eastAsia"/>
                 <w:color w:val="000000"/>
                 <w:sz w:val="18"/>
               </w:rPr>
@@ -1821,12 +1708,11 @@
         </w:tc>
         <w:tc>
           <w:tcPr>
-            <w:tcW w:w="218pt" w:type="dxa"/>
+            <w:tcW w:w="213.75pt" w:type="dxa"/>
           </w:tcPr>
           <w:p>
             <w:pPr>
               <w:rPr>
-                <w:rFonts w:hint="eastAsia"/>
                 <w:color w:val="000000"/>
                 <w:sz w:val="18"/>
               </w:rPr>
@@ -2005,12 +1891,11 @@
       <w:tr>
         <w:tc>
           <w:tcPr>
-            <w:tcW w:w="218pt" w:type="dxa"/>
+            <w:tcW w:w="210.95pt" w:type="dxa"/>
           </w:tcPr>
           <w:p>
             <w:pPr>
               <w:rPr>
-                <w:rFonts w:hint="eastAsia"/>
                 <w:color w:val="000000"/>
                 <w:sz w:val="18"/>
               </w:rPr>
@@ -2043,12 +1928,11 @@
         </w:tc>
         <w:tc>
           <w:tcPr>
-            <w:tcW w:w="218pt" w:type="dxa"/>
+            <w:tcW w:w="213.75pt" w:type="dxa"/>
           </w:tcPr>
           <w:p>
             <w:pPr>
               <w:rPr>
-                <w:rFonts w:hint="eastAsia"/>
                 <w:color w:val="000000"/>
                 <w:sz w:val="18"/>
               </w:rPr>
@@ -2147,12 +2031,11 @@
       <w:tr>
         <w:tc>
           <w:tcPr>
-            <w:tcW w:w="218pt" w:type="dxa"/>
+            <w:tcW w:w="210.95pt" w:type="dxa"/>
           </w:tcPr>
           <w:p>
             <w:pPr>
               <w:rPr>
-                <w:rFonts w:hint="eastAsia"/>
                 <w:color w:val="000000"/>
                 <w:sz w:val="18"/>
               </w:rPr>
@@ -2217,12 +2100,11 @@
         </w:tc>
         <w:tc>
           <w:tcPr>
-            <w:tcW w:w="218pt" w:type="dxa"/>
+            <w:tcW w:w="213.75pt" w:type="dxa"/>
           </w:tcPr>
           <w:p>
             <w:pPr>
               <w:rPr>
-                <w:rFonts w:hint="eastAsia"/>
                 <w:color w:val="000000"/>
                 <w:sz w:val="18"/>
               </w:rPr>
@@ -2289,12 +2171,11 @@
       <w:tr>
         <w:tc>
           <w:tcPr>
-            <w:tcW w:w="218pt" w:type="dxa"/>
+            <w:tcW w:w="210.95pt" w:type="dxa"/>
           </w:tcPr>
           <w:p>
             <w:pPr>
               <w:rPr>
-                <w:rFonts w:hint="eastAsia"/>
                 <w:color w:val="000000"/>
                 <w:sz w:val="18"/>
               </w:rPr>
@@ -2359,12 +2240,11 @@
         </w:tc>
         <w:tc>
           <w:tcPr>
-            <w:tcW w:w="218pt" w:type="dxa"/>
+            <w:tcW w:w="213.75pt" w:type="dxa"/>
           </w:tcPr>
           <w:p>
             <w:pPr>
               <w:rPr>
-                <w:rFonts w:hint="eastAsia"/>
                 <w:color w:val="000000"/>
                 <w:sz w:val="18"/>
               </w:rPr>
@@ -2447,12 +2327,11 @@
       <w:tr>
         <w:tc>
           <w:tcPr>
-            <w:tcW w:w="218pt" w:type="dxa"/>
+            <w:tcW w:w="210.95pt" w:type="dxa"/>
           </w:tcPr>
           <w:p>
             <w:pPr>
               <w:rPr>
-                <w:rFonts w:hint="eastAsia"/>
                 <w:color w:val="000000"/>
                 <w:sz w:val="18"/>
               </w:rPr>
@@ -2485,12 +2364,11 @@
         </w:tc>
         <w:tc>
           <w:tcPr>
-            <w:tcW w:w="218pt" w:type="dxa"/>
+            <w:tcW w:w="213.75pt" w:type="dxa"/>
           </w:tcPr>
           <w:p>
             <w:pPr>
               <w:rPr>
-                <w:rFonts w:hint="eastAsia"/>
                 <w:color w:val="000000"/>
                 <w:sz w:val="18"/>
               </w:rPr>
@@ -2541,12 +2419,11 @@
       <w:tr>
         <w:tc>
           <w:tcPr>
-            <w:tcW w:w="218pt" w:type="dxa"/>
+            <w:tcW w:w="210.95pt" w:type="dxa"/>
           </w:tcPr>
           <w:p>
             <w:pPr>
               <w:rPr>
-                <w:rFonts w:hint="eastAsia"/>
                 <w:color w:val="000000"/>
                 <w:sz w:val="18"/>
               </w:rPr>
@@ -2558,6 +2435,7 @@
                 <w:color w:val="000000"/>
                 <w:sz w:val="18"/>
               </w:rPr>
+              <w:lastRenderedPageBreak/>
               <w:t>发表评论、查看评论、审核评论、删除评论，共</w:t>
             </w:r>
             <w:r>
@@ -2566,7 +2444,15 @@
                 <w:color w:val="000000"/>
                 <w:sz w:val="18"/>
               </w:rPr>
-              <w:t xml:space="preserve"> 4 </w:t>
+              <w:t xml:space="preserve"> </w:t>
+            </w:r>
+            <w:r>
+              <w:rPr>
+                <w:rFonts w:hint="eastAsia"/>
+                <w:color w:val="000000"/>
+                <w:sz w:val="18"/>
+              </w:rPr>
+              <w:t>6</w:t>
             </w:r>
             <w:r>
               <w:rPr>
@@ -2580,12 +2466,11 @@
         </w:tc>
         <w:tc>
           <w:tcPr>
-            <w:tcW w:w="218pt" w:type="dxa"/>
+            <w:tcW w:w="213.75pt" w:type="dxa"/>
           </w:tcPr>
           <w:p>
             <w:pPr>
               <w:rPr>
-                <w:rFonts w:hint="eastAsia"/>
                 <w:color w:val="000000"/>
                 <w:sz w:val="18"/>
               </w:rPr>
@@ -2604,7 +2489,15 @@
                 <w:color w:val="000000"/>
                 <w:sz w:val="18"/>
               </w:rPr>
-              <w:t xml:space="preserve"> 5 </w:t>
+              <w:t xml:space="preserve"> </w:t>
+            </w:r>
+            <w:r>
+              <w:rPr>
+                <w:rFonts w:hint="eastAsia"/>
+                <w:color w:val="000000"/>
+                <w:sz w:val="18"/>
+              </w:rPr>
+              <w:t>6</w:t>
             </w:r>
             <w:r>
               <w:rPr>
@@ -2636,16 +2529,7 @@
                 <w:color w:val="000000"/>
                 <w:sz w:val="18"/>
               </w:rPr>
-              <w:t xml:space="preserve">targetType + </w:t>
-            </w:r>
-            <w:r>
-              <w:rPr>
-                <w:rFonts w:hint="eastAsia"/>
-                <w:color w:val="000000"/>
-                <w:sz w:val="18"/>
-              </w:rPr>
-              <w:lastRenderedPageBreak/>
-              <w:t xml:space="preserve">targetId </w:t>
+              <w:t xml:space="preserve">targetType + targetId </w:t>
             </w:r>
             <w:r>
               <w:rPr>
@@ -2661,12 +2545,11 @@
       <w:tr>
         <w:tc>
           <w:tcPr>
-            <w:tcW w:w="218pt" w:type="dxa"/>
+            <w:tcW w:w="210.95pt" w:type="dxa"/>
           </w:tcPr>
           <w:p>
             <w:pPr>
               <w:rPr>
-                <w:rFonts w:hint="eastAsia"/>
                 <w:color w:val="000000"/>
                 <w:sz w:val="18"/>
               </w:rPr>
@@ -2677,7 +2560,6 @@
                 <w:color w:val="000000"/>
                 <w:sz w:val="18"/>
               </w:rPr>
-              <w:lastRenderedPageBreak/>
               <w:t>点赞、取消点赞、查看我的点赞，共</w:t>
             </w:r>
             <w:r>
@@ -2700,12 +2582,11 @@
         </w:tc>
         <w:tc>
           <w:tcPr>
-            <w:tcW w:w="218pt" w:type="dxa"/>
+            <w:tcW w:w="213.75pt" w:type="dxa"/>
           </w:tcPr>
           <w:p>
             <w:pPr>
               <w:rPr>
-                <w:rFonts w:hint="eastAsia"/>
                 <w:color w:val="000000"/>
                 <w:sz w:val="18"/>
               </w:rPr>
@@ -2804,12 +2685,11 @@
       <w:tr>
         <w:tc>
           <w:tcPr>
-            <w:tcW w:w="218pt" w:type="dxa"/>
+            <w:tcW w:w="210.95pt" w:type="dxa"/>
           </w:tcPr>
           <w:p>
             <w:pPr>
               <w:rPr>
-                <w:rFonts w:hint="eastAsia"/>
                 <w:color w:val="000000"/>
                 <w:sz w:val="18"/>
               </w:rPr>
@@ -2820,34 +2700,33 @@
                 <w:color w:val="000000"/>
                 <w:sz w:val="18"/>
               </w:rPr>
-              <w:t>基于</w:t>
-            </w:r>
-            <w:r>
-              <w:rPr>
-                <w:rFonts w:hint="eastAsia"/>
-                <w:color w:val="000000"/>
-                <w:sz w:val="18"/>
-              </w:rPr>
-              <w:t xml:space="preserve"> Vue.js + Element Plus </w:t>
-            </w:r>
-            <w:r>
-              <w:rPr>
-                <w:rFonts w:hint="eastAsia"/>
-                <w:color w:val="000000"/>
-                <w:sz w:val="18"/>
-              </w:rPr>
-              <w:t>构建，覆盖用户端和管理员端全部页面。</w:t>
+              <w:t>原本无上传模块计划，共</w:t>
+            </w:r>
+            <w:r>
+              <w:rPr>
+                <w:rFonts w:hint="eastAsia"/>
+                <w:color w:val="000000"/>
+                <w:sz w:val="18"/>
+              </w:rPr>
+              <w:t>2</w:t>
+            </w:r>
+            <w:r>
+              <w:rPr>
+                <w:rFonts w:hint="eastAsia"/>
+                <w:color w:val="000000"/>
+                <w:sz w:val="18"/>
+              </w:rPr>
+              <w:t>个接口</w:t>
             </w:r>
           </w:p>
         </w:tc>
         <w:tc>
           <w:tcPr>
-            <w:tcW w:w="218pt" w:type="dxa"/>
+            <w:tcW w:w="213.75pt" w:type="dxa"/>
           </w:tcPr>
           <w:p>
             <w:pPr>
               <w:rPr>
-                <w:rFonts w:hint="eastAsia"/>
                 <w:color w:val="000000"/>
                 <w:sz w:val="18"/>
               </w:rPr>
@@ -2858,23 +2737,103 @@
                 <w:color w:val="000000"/>
                 <w:sz w:val="18"/>
               </w:rPr>
-              <w:t>按期完成。用户端包含首页（猫咪画廊）、猫咪浏览、商品浏览、购物下单、我的订单、我的点赞、个人资料、评论互动等页面；管理员端包含用户管理、</w:t>
-            </w:r>
-            <w:r>
-              <w:rPr>
-                <w:rFonts w:hint="eastAsia"/>
-                <w:color w:val="000000"/>
-                <w:sz w:val="18"/>
-              </w:rPr>
-              <w:t xml:space="preserve"> </w:t>
-            </w:r>
-            <w:r>
-              <w:rPr>
-                <w:rFonts w:hint="eastAsia"/>
-                <w:color w:val="000000"/>
-                <w:sz w:val="18"/>
-              </w:rPr>
-              <w:t>猫咪管理、商品管理、订单管理、评论审核等页面。实现淡橙色主题、红心点赞图标、头像上传、全模块搜索与排序等交互细节。</w:t>
+              <w:t>完成</w:t>
+            </w:r>
+            <w:r>
+              <w:rPr>
+                <w:rFonts w:hint="eastAsia"/>
+                <w:color w:val="000000"/>
+                <w:sz w:val="18"/>
+              </w:rPr>
+              <w:t xml:space="preserve"> 2 </w:t>
+            </w:r>
+            <w:r>
+              <w:rPr>
+                <w:rFonts w:hint="eastAsia"/>
+                <w:color w:val="000000"/>
+                <w:sz w:val="18"/>
+              </w:rPr>
+              <w:t>个接口，</w:t>
+            </w:r>
+            <w:r>
+              <w:rPr>
+                <w:rFonts w:hint="eastAsia"/>
+                <w:color w:val="000000"/>
+                <w:sz w:val="18"/>
+              </w:rPr>
+              <w:t>超出计划。</w:t>
+            </w:r>
+            <w:r>
+              <w:rPr>
+                <w:rFonts w:hint="eastAsia"/>
+                <w:color w:val="000000"/>
+                <w:sz w:val="18"/>
+              </w:rPr>
+              <w:t>管理员可上传商品</w:t>
+            </w:r>
+            <w:r>
+              <w:rPr>
+                <w:rFonts w:hint="eastAsia"/>
+                <w:color w:val="000000"/>
+                <w:sz w:val="18"/>
+              </w:rPr>
+              <w:t>/</w:t>
+            </w:r>
+            <w:r>
+              <w:rPr>
+                <w:rFonts w:hint="eastAsia"/>
+                <w:color w:val="000000"/>
+                <w:sz w:val="18"/>
+              </w:rPr>
+              <w:t>猫咪</w:t>
+            </w:r>
+            <w:r>
+              <w:rPr>
+                <w:rFonts w:hint="eastAsia"/>
+                <w:color w:val="000000"/>
+                <w:sz w:val="18"/>
+              </w:rPr>
+              <w:t>/</w:t>
+            </w:r>
+            <w:r>
+              <w:rPr>
+                <w:rFonts w:hint="eastAsia"/>
+                <w:color w:val="000000"/>
+                <w:sz w:val="18"/>
+              </w:rPr>
+              <w:t>头像图片，普通用户可上传头像；上传文件保存到静态资源目录并返回访问路径，供</w:t>
+            </w:r>
+            <w:r>
+              <w:rPr>
+                <w:rFonts w:hint="eastAsia"/>
+                <w:color w:val="000000"/>
+                <w:sz w:val="18"/>
+              </w:rPr>
+              <w:t xml:space="preserve"> Web </w:t>
+            </w:r>
+            <w:r>
+              <w:rPr>
+                <w:rFonts w:hint="eastAsia"/>
+                <w:color w:val="000000"/>
+                <w:sz w:val="18"/>
+              </w:rPr>
+              <w:t>和</w:t>
+            </w:r>
+            <w:r>
+              <w:rPr>
+                <w:rFonts w:hint="eastAsia"/>
+                <w:color w:val="000000"/>
+                <w:sz w:val="18"/>
+              </w:rPr>
+              <w:t xml:space="preserve"> Android </w:t>
+            </w:r>
+            <w:r>
+              <w:rPr>
+                <w:rFonts w:hint="eastAsia"/>
+                <w:color w:val="000000"/>
+                <w:sz w:val="18"/>
+              </w:rPr>
+              <w:t>共用</w:t>
             </w:r>
           </w:p>
         </w:tc>
@@ -2882,12 +2841,11 @@
       <w:tr>
         <w:tc>
           <w:tcPr>
-            <w:tcW w:w="218pt" w:type="dxa"/>
+            <w:tcW w:w="210.95pt" w:type="dxa"/>
           </w:tcPr>
           <w:p>
             <w:pPr>
               <w:rPr>
-                <w:rFonts w:hint="eastAsia"/>
                 <w:color w:val="000000"/>
                 <w:sz w:val="18"/>
               </w:rPr>
@@ -2898,58 +2856,33 @@
                 <w:color w:val="000000"/>
                 <w:sz w:val="18"/>
               </w:rPr>
-              <w:t xml:space="preserve">Android Studio </w:t>
-            </w:r>
-            <w:r>
-              <w:rPr>
-                <w:rFonts w:hint="eastAsia"/>
-                <w:color w:val="000000"/>
-                <w:sz w:val="18"/>
-              </w:rPr>
-              <w:t>开发，实现顾客端闭环（登录→浏览→下单→订单→点赞</w:t>
-            </w:r>
-            <w:r>
-              <w:rPr>
-                <w:rFonts w:hint="eastAsia"/>
-                <w:color w:val="000000"/>
-                <w:sz w:val="18"/>
-              </w:rPr>
-              <w:t>/</w:t>
-            </w:r>
-            <w:r>
-              <w:rPr>
-                <w:rFonts w:hint="eastAsia"/>
-                <w:color w:val="000000"/>
-                <w:sz w:val="18"/>
-              </w:rPr>
-              <w:t>评论</w:t>
-            </w:r>
-            <w:r>
-              <w:rPr>
-                <w:rFonts w:hint="eastAsia"/>
-                <w:color w:val="000000"/>
-                <w:sz w:val="18"/>
-              </w:rPr>
-              <w:t xml:space="preserve"> </w:t>
-            </w:r>
-            <w:r>
-              <w:rPr>
-                <w:rFonts w:hint="eastAsia"/>
-                <w:color w:val="000000"/>
-                <w:sz w:val="18"/>
-              </w:rPr>
-              <w:t>→个人资料）。</w:t>
+              <w:t>基于</w:t>
+            </w:r>
+            <w:r>
+              <w:rPr>
+                <w:rFonts w:hint="eastAsia"/>
+                <w:color w:val="000000"/>
+                <w:sz w:val="18"/>
+              </w:rPr>
+              <w:t xml:space="preserve"> Vue.js + Element Plus </w:t>
+            </w:r>
+            <w:r>
+              <w:rPr>
+                <w:rFonts w:hint="eastAsia"/>
+                <w:color w:val="000000"/>
+                <w:sz w:val="18"/>
+              </w:rPr>
+              <w:t>构建，覆盖用户端和管理员端全部页面。</w:t>
             </w:r>
           </w:p>
         </w:tc>
         <w:tc>
           <w:tcPr>
-            <w:tcW w:w="218pt" w:type="dxa"/>
+            <w:tcW w:w="213.75pt" w:type="dxa"/>
           </w:tcPr>
           <w:p>
             <w:pPr>
               <w:rPr>
-                <w:rFonts w:hint="eastAsia"/>
                 <w:color w:val="000000"/>
                 <w:sz w:val="18"/>
               </w:rPr>
@@ -2960,7 +2893,54 @@
                 <w:color w:val="000000"/>
                 <w:sz w:val="18"/>
               </w:rPr>
-              <w:t>按期完成。实现首页</w:t>
+              <w:t>按期完成。用户端包含首页（猫咪画廊）、猫咪浏览、商品浏览、购物下单、我的订单、我的点赞、个人资料、评论互动等页面；管理员端包含用户管理、</w:t>
+            </w:r>
+            <w:r>
+              <w:rPr>
+                <w:rFonts w:hint="eastAsia"/>
+                <w:color w:val="000000"/>
+                <w:sz w:val="18"/>
+              </w:rPr>
+              <w:t xml:space="preserve"> </w:t>
+            </w:r>
+            <w:r>
+              <w:rPr>
+                <w:rFonts w:hint="eastAsia"/>
+                <w:color w:val="000000"/>
+                <w:sz w:val="18"/>
+              </w:rPr>
+              <w:t>猫咪管理、商品管理、订单管理、评论审核等页面。实现淡橙色主题、红心点赞图标、头像上传、全模块搜索与排序等交互细节。</w:t>
+            </w:r>
+          </w:p>
+        </w:tc>
+      </w:tr>
+      <w:tr>
+        <w:tc>
+          <w:tcPr>
+            <w:tcW w:w="210.95pt" w:type="dxa"/>
+          </w:tcPr>
+          <w:p>
+            <w:pPr>
+              <w:rPr>
+                <w:color w:val="000000"/>
+                <w:sz w:val="18"/>
+              </w:rPr>
+            </w:pPr>
+            <w:r>
+              <w:rPr>
+                <w:rFonts w:hint="eastAsia"/>
+                <w:color w:val="000000"/>
+                <w:sz w:val="18"/>
+              </w:rPr>
+              <w:t xml:space="preserve">Android Studio </w:t>
+            </w:r>
+            <w:r>
+              <w:rPr>
+                <w:rFonts w:hint="eastAsia"/>
+                <w:color w:val="000000"/>
+                <w:sz w:val="18"/>
+              </w:rPr>
+              <w:t>开发，实现顾客端闭环（登录→浏览→下单→订单→点赞</w:t>
             </w:r>
             <w:r>
               <w:rPr>
@@ -2976,23 +2956,7 @@
                 <w:color w:val="000000"/>
                 <w:sz w:val="18"/>
               </w:rPr>
-              <w:t>服务页业务、点赞交互、评论登录跳转、购物车</w:t>
-            </w:r>
-            <w:r>
-              <w:rPr>
-                <w:rFonts w:hint="eastAsia"/>
-                <w:color w:val="000000"/>
-                <w:sz w:val="18"/>
-              </w:rPr>
-              <w:t xml:space="preserve"> UI</w:t>
-            </w:r>
-            <w:r>
-              <w:rPr>
-                <w:rFonts w:hint="eastAsia"/>
-                <w:color w:val="000000"/>
-                <w:sz w:val="18"/>
-              </w:rPr>
-              <w:t>、</w:t>
+              <w:t>评论</w:t>
             </w:r>
             <w:r>
               <w:rPr>
@@ -3008,87 +2972,156 @@
                 <w:color w:val="000000"/>
                 <w:sz w:val="18"/>
               </w:rPr>
-              <w:t>个人资料页、演示图片资源等功能。使用</w:t>
-            </w:r>
-            <w:r>
-              <w:rPr>
-                <w:rFonts w:hint="eastAsia"/>
-                <w:color w:val="000000"/>
-                <w:sz w:val="18"/>
-              </w:rPr>
-              <w:t xml:space="preserve"> Retrofit </w:t>
-            </w:r>
-            <w:r>
-              <w:rPr>
-                <w:rFonts w:hint="eastAsia"/>
-                <w:color w:val="000000"/>
-                <w:sz w:val="18"/>
-              </w:rPr>
-              <w:t>对接后端</w:t>
-            </w:r>
-            <w:r>
-              <w:rPr>
-                <w:rFonts w:hint="eastAsia"/>
-                <w:color w:val="000000"/>
-                <w:sz w:val="18"/>
-              </w:rPr>
-              <w:t xml:space="preserve"> API</w:t>
-            </w:r>
-            <w:r>
-              <w:rPr>
-                <w:rFonts w:hint="eastAsia"/>
-                <w:color w:val="000000"/>
-                <w:sz w:val="18"/>
-              </w:rPr>
-              <w:t>，</w:t>
-            </w:r>
-            <w:r>
-              <w:rPr>
-                <w:rFonts w:hint="eastAsia"/>
-                <w:color w:val="000000"/>
-                <w:sz w:val="18"/>
-              </w:rPr>
-              <w:t>JWT Token</w:t>
-            </w:r>
-            <w:r>
-              <w:rPr>
-                <w:rFonts w:hint="eastAsia"/>
-                <w:color w:val="000000"/>
-                <w:sz w:val="18"/>
-              </w:rPr>
-              <w:t>认证，</w:t>
-            </w:r>
-            <w:r>
-              <w:rPr>
-                <w:rFonts w:hint="eastAsia"/>
-                <w:color w:val="000000"/>
-                <w:sz w:val="18"/>
-              </w:rPr>
-              <w:t xml:space="preserve">Android Emulator </w:t>
-            </w:r>
-            <w:r>
-              <w:rPr>
-                <w:rFonts w:hint="eastAsia"/>
-                <w:color w:val="000000"/>
-                <w:sz w:val="18"/>
-              </w:rPr>
-              <w:t>通过</w:t>
-            </w:r>
-            <w:r>
-              <w:rPr>
-                <w:rFonts w:hint="eastAsia"/>
-                <w:color w:val="000000"/>
-                <w:sz w:val="18"/>
-              </w:rPr>
-              <w:t xml:space="preserve"> 10.0.2.2 </w:t>
-            </w:r>
-            <w:r>
-              <w:rPr>
-                <w:rFonts w:hint="eastAsia"/>
-                <w:color w:val="000000"/>
-                <w:sz w:val="18"/>
-              </w:rPr>
-              <w:t>访问本机后端。</w:t>
+              <w:t>→个人资料）。</w:t>
+            </w:r>
+          </w:p>
+        </w:tc>
+        <w:tc>
+          <w:tcPr>
+            <w:tcW w:w="213.75pt" w:type="dxa"/>
+          </w:tcPr>
+          <w:p>
+            <w:pPr>
+              <w:rPr>
+                <w:color w:val="000000"/>
+                <w:sz w:val="18"/>
+              </w:rPr>
+            </w:pPr>
+            <w:r>
+              <w:rPr>
+                <w:rFonts w:hint="eastAsia"/>
+                <w:color w:val="000000"/>
+                <w:sz w:val="18"/>
+              </w:rPr>
+              <w:t>按期完成并有所扩展。</w:t>
+            </w:r>
+            <w:r>
+              <w:rPr>
+                <w:rFonts w:hint="eastAsia"/>
+                <w:color w:val="000000"/>
+                <w:sz w:val="18"/>
+              </w:rPr>
+              <w:t xml:space="preserve">Android </w:t>
+            </w:r>
+            <w:r>
+              <w:rPr>
+                <w:rFonts w:hint="eastAsia"/>
+                <w:color w:val="000000"/>
+                <w:sz w:val="18"/>
+              </w:rPr>
+              <w:t>客户端使用</w:t>
+            </w:r>
+            <w:r>
+              <w:rPr>
+                <w:rFonts w:hint="eastAsia"/>
+                <w:color w:val="000000"/>
+                <w:sz w:val="18"/>
+              </w:rPr>
+              <w:t xml:space="preserve"> Java + Retrofit + OkHttp + Glide </w:t>
+            </w:r>
+            <w:r>
+              <w:rPr>
+                <w:rFonts w:hint="eastAsia"/>
+                <w:color w:val="000000"/>
+                <w:sz w:val="18"/>
+              </w:rPr>
+              <w:t>实现，与后端共用同一套</w:t>
+            </w:r>
+            <w:r>
+              <w:rPr>
+                <w:rFonts w:hint="eastAsia"/>
+                <w:color w:val="000000"/>
+                <w:sz w:val="18"/>
+              </w:rPr>
+              <w:t xml:space="preserve"> REST API</w:t>
+            </w:r>
+            <w:r>
+              <w:rPr>
+                <w:rFonts w:hint="eastAsia"/>
+                <w:color w:val="000000"/>
+                <w:sz w:val="18"/>
+              </w:rPr>
+              <w:t>。顾客端已覆盖首页、商品</w:t>
+            </w:r>
+            <w:r>
+              <w:rPr>
+                <w:rFonts w:hint="eastAsia"/>
+                <w:color w:val="000000"/>
+                <w:sz w:val="18"/>
+              </w:rPr>
+              <w:t>/</w:t>
+            </w:r>
+            <w:r>
+              <w:rPr>
+                <w:rFonts w:hint="eastAsia"/>
+                <w:color w:val="000000"/>
+                <w:sz w:val="18"/>
+              </w:rPr>
+              <w:t>猫咪浏览、详情、购物车、下单、我的订单、点赞、评论、我的评论、我的点赞、个人资料、修改密码和注销账号等流程；同时集成轻量管理端，管理员可在</w:t>
+            </w:r>
+            <w:r>
+              <w:rPr>
+                <w:rFonts w:hint="eastAsia"/>
+                <w:color w:val="000000"/>
+                <w:sz w:val="18"/>
+              </w:rPr>
+              <w:t xml:space="preserve"> App </w:t>
+            </w:r>
+            <w:r>
+              <w:rPr>
+                <w:rFonts w:hint="eastAsia"/>
+                <w:color w:val="000000"/>
+                <w:sz w:val="18"/>
+              </w:rPr>
+              <w:t>内进行用户、商品、猫咪、评论、订单的基础管理，商品和猫咪新增</w:t>
+            </w:r>
+            <w:r>
+              <w:rPr>
+                <w:rFonts w:hint="eastAsia"/>
+                <w:color w:val="000000"/>
+                <w:sz w:val="18"/>
+              </w:rPr>
+              <w:t>/</w:t>
+            </w:r>
+            <w:r>
+              <w:rPr>
+                <w:rFonts w:hint="eastAsia"/>
+                <w:color w:val="000000"/>
+                <w:sz w:val="18"/>
+              </w:rPr>
+              <w:t>编辑支持本地图片上传。权限以后端</w:t>
+            </w:r>
+            <w:r>
+              <w:rPr>
+                <w:rFonts w:hint="eastAsia"/>
+                <w:color w:val="000000"/>
+                <w:sz w:val="18"/>
+              </w:rPr>
+              <w:t xml:space="preserve"> token </w:t>
+            </w:r>
+            <w:r>
+              <w:rPr>
+                <w:rFonts w:hint="eastAsia"/>
+                <w:color w:val="000000"/>
+                <w:sz w:val="18"/>
+              </w:rPr>
+              <w:t>和管理员接口校验为准，</w:t>
+            </w:r>
+            <w:r>
+              <w:rPr>
+                <w:rFonts w:hint="eastAsia"/>
+                <w:color w:val="000000"/>
+                <w:sz w:val="18"/>
+              </w:rPr>
+              <w:t xml:space="preserve">Android </w:t>
+            </w:r>
+            <w:r>
+              <w:rPr>
+                <w:rFonts w:hint="eastAsia"/>
+                <w:color w:val="000000"/>
+                <w:sz w:val="18"/>
+              </w:rPr>
+              <w:t>端只做入口分流和界面控制。</w:t>
             </w:r>
           </w:p>
         </w:tc>
@@ -3139,7 +3172,6 @@
     <w:tbl>
       <w:tblPr>
         <w:tblW w:w="436.60pt" w:type="dxa"/>
-        <w:tblInd w:w="0pt" w:type="dxa"/>
         <w:tblBorders>
           <w:top w:val="single" w:sz="4" w:space="0" w:color="auto"/>
           <w:start w:val="single" w:sz="4" w:space="0" w:color="auto"/>
@@ -3167,7 +3199,6 @@
             <w:pPr>
               <w:jc w:val="center"/>
               <w:rPr>
-                <w:rFonts w:hint="eastAsia"/>
                 <w:b/>
                 <w:bCs/>
                 <w:color w:val="000000"/>
@@ -3195,7 +3226,6 @@
             <w:pPr>
               <w:jc w:val="center"/>
               <w:rPr>
-                <w:rFonts w:hint="eastAsia"/>
                 <w:b/>
                 <w:bCs/>
                 <w:color w:val="000000"/>
@@ -3233,7 +3263,6 @@
               </w:tabs>
               <w:snapToGrid/>
               <w:rPr>
-                <w:rFonts w:hint="eastAsia"/>
                 <w:color w:val="000000"/>
                 <w:szCs w:val="24"/>
               </w:rPr>
@@ -3255,7 +3284,6 @@
           <w:p>
             <w:pPr>
               <w:rPr>
-                <w:rFonts w:hint="eastAsia"/>
                 <w:color w:val="000000"/>
                 <w:sz w:val="18"/>
               </w:rPr>
@@ -3394,7 +3422,16 @@
                 <w:color w:val="000000"/>
                 <w:sz w:val="18"/>
               </w:rPr>
-              <w:t>评论时关联点赞的清理）经专项排查与修复，避免残留脏数据。测试账号体系（管理员</w:t>
+              <w:t>评论时关联点赞的清</w:t>
+            </w:r>
+            <w:r>
+              <w:rPr>
+                <w:rFonts w:hint="eastAsia"/>
+                <w:color w:val="000000"/>
+                <w:sz w:val="18"/>
+              </w:rPr>
+              <w:lastRenderedPageBreak/>
+              <w:t>理）经专项排查与修复，避免残留脏数据。测试账号体系（管理员</w:t>
             </w:r>
             <w:r>
               <w:rPr>
@@ -3425,7 +3462,6 @@
             <w:pPr>
               <w:jc w:val="center"/>
               <w:rPr>
-                <w:rFonts w:hint="eastAsia"/>
                 <w:color w:val="000000"/>
                 <w:sz w:val="18"/>
               </w:rPr>
@@ -3436,6 +3472,7 @@
                 <w:color w:val="000000"/>
                 <w:sz w:val="18"/>
               </w:rPr>
+              <w:lastRenderedPageBreak/>
               <w:t>健壮性</w:t>
             </w:r>
           </w:p>
@@ -3447,7 +3484,6 @@
           <w:p>
             <w:pPr>
               <w:rPr>
-                <w:rFonts w:hint="eastAsia"/>
                 <w:color w:val="000000"/>
                 <w:sz w:val="18"/>
               </w:rPr>
@@ -3505,7 +3541,6 @@
             <w:pPr>
               <w:jc w:val="center"/>
               <w:rPr>
-                <w:rFonts w:hint="eastAsia"/>
                 <w:color w:val="000000"/>
                 <w:sz w:val="18"/>
               </w:rPr>
@@ -3527,7 +3562,6 @@
           <w:p>
             <w:pPr>
               <w:rPr>
-                <w:rFonts w:hint="eastAsia"/>
                 <w:color w:val="000000"/>
                 <w:sz w:val="18"/>
               </w:rPr>
@@ -3617,7 +3651,6 @@
             <w:pPr>
               <w:jc w:val="center"/>
               <w:rPr>
-                <w:rFonts w:hint="eastAsia"/>
                 <w:color w:val="000000"/>
                 <w:sz w:val="18"/>
               </w:rPr>
@@ -3639,7 +3672,6 @@
           <w:p>
             <w:pPr>
               <w:rPr>
-                <w:rFonts w:hint="eastAsia"/>
                 <w:color w:val="000000"/>
                 <w:sz w:val="18"/>
               </w:rPr>
@@ -3674,16 +3706,7 @@
                 <w:color w:val="000000"/>
                 <w:sz w:val="18"/>
               </w:rPr>
-              <w:t xml:space="preserve"> </w:t>
-            </w:r>
-            <w:r>
-              <w:rPr>
-                <w:rFonts w:hint="eastAsia"/>
-                <w:color w:val="000000"/>
-                <w:sz w:val="18"/>
-              </w:rPr>
-              <w:lastRenderedPageBreak/>
-              <w:t xml:space="preserve">skip/limit </w:t>
+              <w:t xml:space="preserve"> skip/limit </w:t>
             </w:r>
             <w:r>
               <w:rPr>
@@ -3770,7 +3793,6 @@
             <w:pPr>
               <w:jc w:val="center"/>
               <w:rPr>
-                <w:rFonts w:hint="eastAsia"/>
                 <w:color w:val="000000"/>
                 <w:sz w:val="18"/>
               </w:rPr>
@@ -3781,7 +3803,6 @@
                 <w:color w:val="000000"/>
                 <w:sz w:val="18"/>
               </w:rPr>
-              <w:lastRenderedPageBreak/>
               <w:t>易用性</w:t>
             </w:r>
           </w:p>
@@ -3793,7 +3814,6 @@
           <w:p>
             <w:pPr>
               <w:rPr>
-                <w:rFonts w:hint="eastAsia"/>
                 <w:color w:val="000000"/>
                 <w:sz w:val="18"/>
               </w:rPr>
@@ -3883,7 +3903,6 @@
             <w:pPr>
               <w:jc w:val="center"/>
               <w:rPr>
-                <w:rFonts w:hint="eastAsia"/>
                 <w:color w:val="000000"/>
                 <w:sz w:val="18"/>
               </w:rPr>
@@ -3905,7 +3924,6 @@
           <w:p>
             <w:pPr>
               <w:rPr>
-                <w:rFonts w:hint="eastAsia"/>
                 <w:color w:val="000000"/>
                 <w:sz w:val="18"/>
               </w:rPr>
@@ -4012,7 +4030,15 @@
                 <w:color w:val="000000"/>
                 <w:sz w:val="18"/>
               </w:rPr>
-              <w:t>（路由注册）。各模块独立文件，职责单一。开发日志（开发日志</w:t>
+              <w:t>（路由注册）。各模块独立文件，职责单一。</w:t>
+            </w:r>
+            <w:r>
+              <w:rPr>
+                <w:rFonts w:hint="eastAsia"/>
+                <w:color w:val="000000"/>
+                <w:sz w:val="18"/>
+              </w:rPr>
+              <w:t>开发日志（开发日志</w:t>
             </w:r>
             <w:r>
               <w:rPr>
@@ -4044,23 +4070,71 @@
                 <w:color w:val="000000"/>
                 <w:sz w:val="18"/>
               </w:rPr>
-              <w:t>）详细记录了设计决策、</w:t>
-            </w:r>
-            <w:r>
-              <w:rPr>
-                <w:rFonts w:hint="eastAsia"/>
-                <w:color w:val="000000"/>
-                <w:sz w:val="18"/>
-              </w:rPr>
-              <w:t>API</w:t>
-            </w:r>
-            <w:r>
-              <w:rPr>
-                <w:rFonts w:hint="eastAsia"/>
-                <w:color w:val="000000"/>
-                <w:sz w:val="18"/>
-              </w:rPr>
-              <w:t>说明、变更历史和</w:t>
+              <w:t>、开发日志</w:t>
+            </w:r>
+            <w:r>
+              <w:rPr>
+                <w:rFonts w:hint="eastAsia"/>
+                <w:color w:val="000000"/>
+                <w:sz w:val="18"/>
+              </w:rPr>
+              <w:t>3.md</w:t>
+            </w:r>
+            <w:r>
+              <w:rPr>
+                <w:rFonts w:hint="eastAsia"/>
+                <w:color w:val="000000"/>
+                <w:sz w:val="18"/>
+              </w:rPr>
+              <w:t>、开发日志</w:t>
+            </w:r>
+            <w:r>
+              <w:rPr>
+                <w:rFonts w:hint="eastAsia"/>
+                <w:color w:val="000000"/>
+                <w:sz w:val="18"/>
+              </w:rPr>
+              <w:t>4.md</w:t>
+            </w:r>
+            <w:r>
+              <w:rPr>
+                <w:rFonts w:hint="eastAsia"/>
+                <w:color w:val="000000"/>
+                <w:sz w:val="18"/>
+              </w:rPr>
+              <w:t>）记录了数据库设计、接口变更、</w:t>
+            </w:r>
+            <w:r>
+              <w:rPr>
+                <w:rFonts w:hint="eastAsia"/>
+                <w:color w:val="000000"/>
+                <w:sz w:val="18"/>
+              </w:rPr>
+              <w:t xml:space="preserve">Web </w:t>
+            </w:r>
+            <w:r>
+              <w:rPr>
+                <w:rFonts w:hint="eastAsia"/>
+                <w:color w:val="000000"/>
+                <w:sz w:val="18"/>
+              </w:rPr>
+              <w:t>整合、</w:t>
+            </w:r>
+            <w:r>
+              <w:rPr>
+                <w:rFonts w:hint="eastAsia"/>
+                <w:color w:val="000000"/>
+                <w:sz w:val="18"/>
+              </w:rPr>
+              <w:t xml:space="preserve">Android </w:t>
+            </w:r>
+            <w:r>
+              <w:rPr>
+                <w:rFonts w:hint="eastAsia"/>
+                <w:color w:val="000000"/>
+                <w:sz w:val="18"/>
+              </w:rPr>
+              <w:t>接手与管理端能力、测试验证和</w:t>
             </w:r>
             <w:r>
               <w:rPr>
@@ -4076,7 +4150,55 @@
                 <w:color w:val="000000"/>
                 <w:sz w:val="18"/>
               </w:rPr>
-              <w:t>修复，便于后续维护者快速了解项目。</w:t>
+              <w:t>修复过程；其中开发日志</w:t>
+            </w:r>
+            <w:r>
+              <w:rPr>
+                <w:rFonts w:hint="eastAsia"/>
+                <w:color w:val="000000"/>
+                <w:sz w:val="18"/>
+              </w:rPr>
+              <w:t xml:space="preserve">3.md </w:t>
+            </w:r>
+            <w:r>
+              <w:rPr>
+                <w:rFonts w:hint="eastAsia"/>
+                <w:color w:val="000000"/>
+                <w:sz w:val="18"/>
+              </w:rPr>
+              <w:t>和开发日志</w:t>
+            </w:r>
+            <w:r>
+              <w:rPr>
+                <w:rFonts w:hint="eastAsia"/>
+                <w:color w:val="000000"/>
+                <w:sz w:val="18"/>
+              </w:rPr>
+              <w:t xml:space="preserve">4.md </w:t>
+            </w:r>
+            <w:r>
+              <w:rPr>
+                <w:rFonts w:hint="eastAsia"/>
+                <w:color w:val="000000"/>
+                <w:sz w:val="18"/>
+              </w:rPr>
+              <w:t>对</w:t>
+            </w:r>
+            <w:r>
+              <w:rPr>
+                <w:rFonts w:hint="eastAsia"/>
+                <w:color w:val="000000"/>
+                <w:sz w:val="18"/>
+              </w:rPr>
+              <w:t xml:space="preserve"> Android </w:t>
+            </w:r>
+            <w:r>
+              <w:rPr>
+                <w:rFonts w:hint="eastAsia"/>
+                <w:color w:val="000000"/>
+                <w:sz w:val="18"/>
+              </w:rPr>
+              <w:t>当前能力边界、生日校验、评论排序、前端体验优化等最终状态作了补充说明，便于后续维护者快速了解项目。</w:t>
             </w:r>
           </w:p>
         </w:tc>
@@ -4091,7 +4213,6 @@
             <w:pPr>
               <w:jc w:val="center"/>
               <w:rPr>
-                <w:rFonts w:hint="eastAsia"/>
                 <w:color w:val="000000"/>
                 <w:sz w:val="18"/>
               </w:rPr>
@@ -4113,7 +4234,6 @@
           <w:p>
             <w:pPr>
               <w:rPr>
-                <w:rFonts w:hint="eastAsia"/>
                 <w:color w:val="000000"/>
                 <w:sz w:val="18"/>
               </w:rPr>
@@ -4267,7 +4387,6 @@
             <w:pPr>
               <w:jc w:val="center"/>
               <w:rPr>
-                <w:rFonts w:hint="eastAsia"/>
                 <w:color w:val="000000"/>
                 <w:sz w:val="18"/>
               </w:rPr>
@@ -4289,7 +4408,6 @@
           <w:p>
             <w:pPr>
               <w:rPr>
-                <w:rFonts w:hint="eastAsia"/>
                 <w:color w:val="000000"/>
                 <w:sz w:val="18"/>
               </w:rPr>
@@ -4491,7 +4609,6 @@
             <w:pPr>
               <w:jc w:val="center"/>
               <w:rPr>
-                <w:rFonts w:hint="eastAsia"/>
                 <w:color w:val="000000"/>
                 <w:sz w:val="18"/>
               </w:rPr>
@@ -4513,7 +4630,6 @@
           <w:p>
             <w:pPr>
               <w:rPr>
-                <w:rFonts w:hint="eastAsia"/>
                 <w:color w:val="000000"/>
                 <w:sz w:val="18"/>
               </w:rPr>
@@ -4683,7 +4799,6 @@
             <w:pPr>
               <w:jc w:val="center"/>
               <w:rPr>
-                <w:rFonts w:hint="eastAsia"/>
                 <w:color w:val="000000"/>
                 <w:sz w:val="18"/>
               </w:rPr>
@@ -4694,6 +4809,7 @@
                 <w:color w:val="000000"/>
                 <w:sz w:val="18"/>
               </w:rPr>
+              <w:lastRenderedPageBreak/>
               <w:t>可移植性</w:t>
             </w:r>
           </w:p>
@@ -4705,7 +4821,6 @@
           <w:p>
             <w:pPr>
               <w:rPr>
-                <w:rFonts w:hint="eastAsia"/>
                 <w:color w:val="000000"/>
                 <w:sz w:val="18"/>
               </w:rPr>
@@ -4716,119 +4831,71 @@
                 <w:color w:val="000000"/>
                 <w:sz w:val="18"/>
               </w:rPr>
-              <w:t>优秀。后端基于</w:t>
-            </w:r>
-            <w:r>
-              <w:rPr>
-                <w:rFonts w:hint="eastAsia"/>
-                <w:color w:val="000000"/>
-                <w:sz w:val="18"/>
-              </w:rPr>
-              <w:t xml:space="preserve"> Python 3.12+</w:t>
-            </w:r>
-            <w:r>
-              <w:rPr>
-                <w:rFonts w:hint="eastAsia"/>
-                <w:color w:val="000000"/>
-                <w:sz w:val="18"/>
-              </w:rPr>
-              <w:t>，依赖清单在</w:t>
-            </w:r>
-            <w:r>
-              <w:rPr>
-                <w:rFonts w:hint="eastAsia"/>
-                <w:color w:val="000000"/>
-                <w:sz w:val="18"/>
-              </w:rPr>
-              <w:t xml:space="preserve"> requirements.txt </w:t>
-            </w:r>
-            <w:r>
-              <w:rPr>
-                <w:rFonts w:hint="eastAsia"/>
-                <w:color w:val="000000"/>
-                <w:sz w:val="18"/>
-              </w:rPr>
-              <w:t>中完整列出，通过</w:t>
-            </w:r>
-            <w:r>
-              <w:rPr>
-                <w:rFonts w:hint="eastAsia"/>
-                <w:color w:val="000000"/>
-                <w:sz w:val="18"/>
-              </w:rPr>
-              <w:t xml:space="preserve"> pip install </w:t>
-            </w:r>
-            <w:r>
-              <w:rPr>
-                <w:rFonts w:hint="eastAsia"/>
-                <w:color w:val="000000"/>
-                <w:sz w:val="18"/>
-              </w:rPr>
-              <w:t>即可复现环境。虚拟环境隔离（</w:t>
-            </w:r>
-            <w:r>
-              <w:rPr>
-                <w:rFonts w:hint="eastAsia"/>
-                <w:color w:val="000000"/>
-                <w:sz w:val="18"/>
-              </w:rPr>
-              <w:t>venv</w:t>
-            </w:r>
-            <w:r>
-              <w:rPr>
-                <w:rFonts w:hint="eastAsia"/>
-                <w:color w:val="000000"/>
-                <w:sz w:val="18"/>
-              </w:rPr>
-              <w:t>）。数据库脚本使用标准</w:t>
-            </w:r>
-            <w:r>
-              <w:rPr>
-                <w:rFonts w:hint="eastAsia"/>
-                <w:color w:val="000000"/>
-                <w:sz w:val="18"/>
-              </w:rPr>
-              <w:t xml:space="preserve"> SQL</w:t>
-            </w:r>
-            <w:r>
-              <w:rPr>
-                <w:rFonts w:hint="eastAsia"/>
-                <w:color w:val="000000"/>
-                <w:sz w:val="18"/>
-              </w:rPr>
-              <w:t>，不依赖</w:t>
-            </w:r>
-            <w:r>
-              <w:rPr>
-                <w:rFonts w:hint="eastAsia"/>
-                <w:color w:val="000000"/>
-                <w:sz w:val="18"/>
-              </w:rPr>
-              <w:t xml:space="preserve"> MySQL</w:t>
-            </w:r>
-            <w:r>
-              <w:rPr>
-                <w:rFonts w:hint="eastAsia"/>
-                <w:color w:val="000000"/>
-                <w:sz w:val="18"/>
-              </w:rPr>
-              <w:t>特有语法（除排序规则</w:t>
-            </w:r>
-            <w:r>
-              <w:rPr>
-                <w:rFonts w:hint="eastAsia"/>
-                <w:color w:val="000000"/>
-                <w:sz w:val="18"/>
-              </w:rPr>
-              <w:t xml:space="preserve"> utf8mb4_unicode_ci </w:t>
-            </w:r>
-            <w:r>
-              <w:rPr>
-                <w:rFonts w:hint="eastAsia"/>
-                <w:color w:val="000000"/>
-                <w:sz w:val="18"/>
-              </w:rPr>
-              <w:t>外）。</w:t>
+              <w:t>优秀。后端依赖清单在</w:t>
+            </w:r>
+            <w:r>
+              <w:rPr>
+                <w:rFonts w:hint="eastAsia"/>
+                <w:color w:val="000000"/>
+                <w:sz w:val="18"/>
+              </w:rPr>
+              <w:t xml:space="preserve"> backend/requirements.txt </w:t>
+            </w:r>
+            <w:r>
+              <w:rPr>
+                <w:rFonts w:hint="eastAsia"/>
+                <w:color w:val="000000"/>
+                <w:sz w:val="18"/>
+              </w:rPr>
+              <w:t>中列出，可通过虚拟环境安装依赖并启动</w:t>
+            </w:r>
+            <w:r>
+              <w:rPr>
+                <w:rFonts w:hint="eastAsia"/>
+                <w:color w:val="000000"/>
+                <w:sz w:val="18"/>
+              </w:rPr>
+              <w:t xml:space="preserve"> FastAPI </w:t>
+            </w:r>
+            <w:r>
+              <w:rPr>
+                <w:rFonts w:hint="eastAsia"/>
+                <w:color w:val="000000"/>
+                <w:sz w:val="18"/>
+              </w:rPr>
+              <w:t>服务；数据库建表脚本集中在</w:t>
+            </w:r>
+            <w:r>
+              <w:rPr>
+                <w:rFonts w:hint="eastAsia"/>
+                <w:color w:val="000000"/>
+                <w:sz w:val="18"/>
+              </w:rPr>
+              <w:t>database/init.sql</w:t>
+            </w:r>
+            <w:r>
+              <w:rPr>
+                <w:rFonts w:hint="eastAsia"/>
+                <w:color w:val="000000"/>
+                <w:sz w:val="18"/>
+              </w:rPr>
+              <w:t>，可在</w:t>
+            </w:r>
+            <w:r>
+              <w:rPr>
+                <w:rFonts w:hint="eastAsia"/>
+                <w:color w:val="000000"/>
+                <w:sz w:val="18"/>
+              </w:rPr>
+              <w:t xml:space="preserve"> MySQL 8.0 </w:t>
+            </w:r>
+            <w:r>
+              <w:rPr>
+                <w:rFonts w:hint="eastAsia"/>
+                <w:color w:val="000000"/>
+                <w:sz w:val="18"/>
+              </w:rPr>
+              <w:t>环境执行。</w:t>
             </w:r>
             <w:r>
               <w:rPr>
@@ -4844,23 +4911,71 @@
                 <w:color w:val="000000"/>
                 <w:sz w:val="18"/>
               </w:rPr>
-              <w:t>前端通过</w:t>
-            </w:r>
-            <w:r>
-              <w:rPr>
-                <w:rFonts w:hint="eastAsia"/>
-                <w:color w:val="000000"/>
-                <w:sz w:val="18"/>
-              </w:rPr>
-              <w:t xml:space="preserve"> npm install + npm run dev </w:t>
-            </w:r>
-            <w:r>
-              <w:rPr>
-                <w:rFonts w:hint="eastAsia"/>
-                <w:color w:val="000000"/>
-                <w:sz w:val="18"/>
-              </w:rPr>
-              <w:t>即可启动。</w:t>
+              <w:t>前端位于</w:t>
+            </w:r>
+            <w:r>
+              <w:rPr>
+                <w:rFonts w:hint="eastAsia"/>
+                <w:color w:val="000000"/>
+                <w:sz w:val="18"/>
+              </w:rPr>
+              <w:t xml:space="preserve"> web/cat-cafe-ui</w:t>
+            </w:r>
+            <w:r>
+              <w:rPr>
+                <w:rFonts w:hint="eastAsia"/>
+                <w:color w:val="000000"/>
+                <w:sz w:val="18"/>
+              </w:rPr>
+              <w:t>，使用</w:t>
+            </w:r>
+            <w:r>
+              <w:rPr>
+                <w:rFonts w:hint="eastAsia"/>
+                <w:color w:val="000000"/>
+                <w:sz w:val="18"/>
+              </w:rPr>
+              <w:t xml:space="preserve"> npm install </w:t>
+            </w:r>
+            <w:r>
+              <w:rPr>
+                <w:rFonts w:hint="eastAsia"/>
+                <w:color w:val="000000"/>
+                <w:sz w:val="18"/>
+              </w:rPr>
+              <w:t>和</w:t>
+            </w:r>
+            <w:r>
+              <w:rPr>
+                <w:rFonts w:hint="eastAsia"/>
+                <w:color w:val="000000"/>
+                <w:sz w:val="18"/>
+              </w:rPr>
+              <w:t xml:space="preserve"> npm run dev </w:t>
+            </w:r>
+            <w:r>
+              <w:rPr>
+                <w:rFonts w:hint="eastAsia"/>
+                <w:color w:val="000000"/>
+                <w:sz w:val="18"/>
+              </w:rPr>
+              <w:t>启动开发服务，使用</w:t>
+            </w:r>
+            <w:r>
+              <w:rPr>
+                <w:rFonts w:hint="eastAsia"/>
+                <w:color w:val="000000"/>
+                <w:sz w:val="18"/>
+              </w:rPr>
+              <w:t xml:space="preserve"> npm run build </w:t>
+            </w:r>
+            <w:r>
+              <w:rPr>
+                <w:rFonts w:hint="eastAsia"/>
+                <w:color w:val="000000"/>
+                <w:sz w:val="18"/>
+              </w:rPr>
+              <w:t>生成构建产物。</w:t>
             </w:r>
             <w:r>
               <w:rPr>
@@ -4884,15 +4999,15 @@
                 <w:color w:val="000000"/>
                 <w:sz w:val="18"/>
               </w:rPr>
-              <w:t xml:space="preserve"> Gradle </w:t>
-            </w:r>
-            <w:r>
-              <w:rPr>
-                <w:rFonts w:hint="eastAsia"/>
-                <w:color w:val="000000"/>
-                <w:sz w:val="18"/>
-              </w:rPr>
-              <w:t>构建，标准</w:t>
+              <w:t xml:space="preserve">Gradle </w:t>
+            </w:r>
+            <w:r>
+              <w:rPr>
+                <w:rFonts w:hint="eastAsia"/>
+                <w:color w:val="000000"/>
+                <w:sz w:val="18"/>
+              </w:rPr>
+              <w:t>构建，可通过</w:t>
             </w:r>
             <w:r>
               <w:rPr>
@@ -4908,7 +5023,103 @@
                 <w:color w:val="000000"/>
                 <w:sz w:val="18"/>
               </w:rPr>
-              <w:t>导入即可。</w:t>
+              <w:t>导入或执行</w:t>
+            </w:r>
+            <w:r>
+              <w:rPr>
+                <w:rFonts w:hint="eastAsia"/>
+                <w:color w:val="000000"/>
+                <w:sz w:val="18"/>
+              </w:rPr>
+              <w:t xml:space="preserve"> gradlew.batassembleDebug </w:t>
+            </w:r>
+            <w:r>
+              <w:rPr>
+                <w:rFonts w:hint="eastAsia"/>
+                <w:color w:val="000000"/>
+                <w:sz w:val="18"/>
+              </w:rPr>
+              <w:t>生成调试</w:t>
+            </w:r>
+            <w:r>
+              <w:rPr>
+                <w:rFonts w:hint="eastAsia"/>
+                <w:color w:val="000000"/>
+                <w:sz w:val="18"/>
+              </w:rPr>
+              <w:t xml:space="preserve"> APK</w:t>
+            </w:r>
+            <w:r>
+              <w:rPr>
+                <w:rFonts w:hint="eastAsia"/>
+                <w:color w:val="000000"/>
+                <w:sz w:val="18"/>
+              </w:rPr>
+              <w:t>。项目还提供</w:t>
+            </w:r>
+            <w:r>
+              <w:rPr>
+                <w:rFonts w:hint="eastAsia"/>
+                <w:color w:val="000000"/>
+                <w:sz w:val="18"/>
+              </w:rPr>
+              <w:t xml:space="preserve"> docker-compose.yml</w:t>
+            </w:r>
+            <w:r>
+              <w:rPr>
+                <w:rFonts w:hint="eastAsia"/>
+                <w:color w:val="000000"/>
+                <w:sz w:val="18"/>
+              </w:rPr>
+              <w:t>、</w:t>
+            </w:r>
+            <w:r>
+              <w:rPr>
+                <w:rFonts w:hint="eastAsia"/>
+                <w:color w:val="000000"/>
+                <w:sz w:val="18"/>
+              </w:rPr>
+              <w:t>docker-compose.prod.yml</w:t>
+            </w:r>
+            <w:r>
+              <w:rPr>
+                <w:rFonts w:hint="eastAsia"/>
+                <w:color w:val="000000"/>
+                <w:sz w:val="18"/>
+              </w:rPr>
+              <w:t>、</w:t>
+            </w:r>
+            <w:r>
+              <w:rPr>
+                <w:rFonts w:hint="eastAsia"/>
+                <w:color w:val="000000"/>
+                <w:sz w:val="18"/>
+              </w:rPr>
+              <w:t xml:space="preserve">backend/Dockerfile.prod </w:t>
+            </w:r>
+            <w:r>
+              <w:rPr>
+                <w:rFonts w:hint="eastAsia"/>
+                <w:color w:val="000000"/>
+                <w:sz w:val="18"/>
+              </w:rPr>
+              <w:t>和</w:t>
+            </w:r>
+            <w:r>
+              <w:rPr>
+                <w:rFonts w:hint="eastAsia"/>
+                <w:color w:val="000000"/>
+                <w:sz w:val="18"/>
+              </w:rPr>
+              <w:t xml:space="preserve"> nginx</w:t>
+            </w:r>
+            <w:r>
+              <w:rPr>
+                <w:rFonts w:hint="eastAsia"/>
+                <w:color w:val="000000"/>
+                <w:sz w:val="18"/>
+              </w:rPr>
+              <w:t>配置，支持本地开发和生产部署两种运行方式。</w:t>
             </w:r>
           </w:p>
         </w:tc>
@@ -4947,7 +5158,6 @@
     <w:p>
       <w:pPr>
         <w:rPr>
-          <w:rFonts w:hint="eastAsia"/>
           <w:color w:val="000000"/>
           <w:sz w:val="18"/>
         </w:rPr>
@@ -4956,7 +5166,6 @@
     <w:p>
       <w:pPr>
         <w:rPr>
-          <w:rFonts w:hint="eastAsia"/>
           <w:color w:val="000000"/>
           <w:szCs w:val="21"/>
         </w:rPr>
@@ -5005,7 +5214,6 @@
     <w:p>
       <w:pPr>
         <w:rPr>
-          <w:rFonts w:hint="eastAsia"/>
           <w:color w:val="000000"/>
           <w:szCs w:val="21"/>
         </w:rPr>
@@ -5030,7 +5238,6 @@
     <w:p>
       <w:pPr>
         <w:rPr>
-          <w:rFonts w:hint="eastAsia"/>
           <w:color w:val="000000"/>
           <w:szCs w:val="21"/>
         </w:rPr>
@@ -5041,22 +5248,12 @@
           <w:color w:val="000000"/>
           <w:szCs w:val="21"/>
         </w:rPr>
-        <w:t>传统猫咖点单系统中猫咪信息呈现单一（仅名字、品种、年龄），顾客面对多只猫咪难以快速决策。本系统通过个性化数字名片（性格标签、趣味战绩、照片画廊）让猫咪形</w:t>
-      </w:r>
-      <w:r>
-        <w:rPr>
-          <w:rFonts w:hint="eastAsia"/>
-          <w:color w:val="000000"/>
-          <w:szCs w:val="21"/>
-        </w:rPr>
-        <w:lastRenderedPageBreak/>
-        <w:t>象更鲜活，帮助顾客更快建立情感联结，减少决策犹豫，提升点单转化率。</w:t>
+        <w:t>传统猫咖点单系统中猫咪信息呈现单一（仅名字、品种、年龄），顾客面对多只猫咪难以快速决策。本系统通过个性化数字名片（性格标签、趣味战绩、照片画廊）让猫咪形象更鲜活，帮助顾客更快建立情感联结，减少决策犹豫，提升点单转化率。</w:t>
       </w:r>
     </w:p>
     <w:p>
       <w:pPr>
         <w:rPr>
-          <w:rFonts w:hint="eastAsia"/>
           <w:color w:val="000000"/>
           <w:szCs w:val="21"/>
         </w:rPr>
@@ -5081,7 +5278,6 @@
     <w:p>
       <w:pPr>
         <w:rPr>
-          <w:rFonts w:hint="eastAsia"/>
           <w:color w:val="000000"/>
           <w:szCs w:val="21"/>
         </w:rPr>
@@ -5098,7 +5294,6 @@
     <w:p>
       <w:pPr>
         <w:rPr>
-          <w:rFonts w:hint="eastAsia"/>
           <w:color w:val="000000"/>
           <w:szCs w:val="21"/>
         </w:rPr>
@@ -5123,7 +5318,6 @@
     <w:p>
       <w:pPr>
         <w:rPr>
-          <w:rFonts w:hint="eastAsia"/>
           <w:color w:val="000000"/>
           <w:szCs w:val="21"/>
         </w:rPr>
@@ -5204,7 +5398,6 @@
     <w:p>
       <w:pPr>
         <w:rPr>
-          <w:rFonts w:hint="eastAsia"/>
           <w:color w:val="000000"/>
           <w:szCs w:val="21"/>
         </w:rPr>
@@ -5229,7 +5422,6 @@
     <w:p>
       <w:pPr>
         <w:rPr>
-          <w:rFonts w:hint="eastAsia"/>
           <w:color w:val="000000"/>
           <w:szCs w:val="21"/>
         </w:rPr>
@@ -5248,7 +5440,7 @@
           <w:color w:val="000000"/>
           <w:szCs w:val="21"/>
         </w:rPr>
-        <w:t>端适合店内大屏展示和后台管理，</w:t>
+        <w:t>端同时覆盖顾客浏览点单和管理员后台管理，适合桌面浏览器、店内设备和运营人员使用；</w:t>
       </w:r>
       <w:r>
         <w:rPr>
@@ -5264,13 +5456,28 @@
           <w:color w:val="000000"/>
           <w:szCs w:val="21"/>
         </w:rPr>
-        <w:t>端方便顾客手机扫码自助点单，双端覆盖适应不同使用场景。</w:t>
+        <w:t>端覆盖移动端顾客自助点单，并补充管理入口，适合手机端快速浏览、下单和处理基础管理任务。双端共用同一套后端</w:t>
+      </w:r>
+      <w:r>
+        <w:rPr>
+          <w:rFonts w:hint="eastAsia"/>
+          <w:color w:val="000000"/>
+          <w:szCs w:val="21"/>
+        </w:rPr>
+        <w:t xml:space="preserve"> API</w:t>
+      </w:r>
+      <w:r>
+        <w:rPr>
+          <w:rFonts w:hint="eastAsia"/>
+          <w:color w:val="000000"/>
+          <w:szCs w:val="21"/>
+        </w:rPr>
+        <w:t>，减少重复开发并保证业务规则一致。</w:t>
       </w:r>
     </w:p>
     <w:p>
       <w:pPr>
         <w:rPr>
-          <w:rFonts w:hint="eastAsia"/>
           <w:color w:val="000000"/>
           <w:szCs w:val="21"/>
         </w:rPr>
@@ -5295,7 +5502,6 @@
     <w:p>
       <w:pPr>
         <w:rPr>
-          <w:rFonts w:hint="eastAsia"/>
           <w:color w:val="000000"/>
           <w:szCs w:val="21"/>
         </w:rPr>
@@ -5376,7 +5582,6 @@
     <w:p>
       <w:pPr>
         <w:rPr>
-          <w:rFonts w:hint="eastAsia"/>
           <w:color w:val="000000"/>
           <w:sz w:val="18"/>
         </w:rPr>
@@ -5414,17 +5619,260 @@
     </w:p>
     <w:p>
       <w:pPr>
-        <w:rPr>
-          <w:rFonts w:hint="eastAsia"/>
+        <w:ind w:firstLine="21pt"/>
+        <w:rPr>
           <w:color w:val="000000"/>
           <w:sz w:val="18"/>
         </w:rPr>
       </w:pPr>
+      <w:r>
+        <w:rPr>
+          <w:rFonts w:hint="eastAsia"/>
+          <w:color w:val="000000"/>
+          <w:sz w:val="18"/>
+        </w:rPr>
+        <w:t>通过本项目，我对软件工程课程中“计划、需求、设计、编码、测试、文档、维护”这些环节有</w:t>
+      </w:r>
+      <w:r>
+        <w:rPr>
+          <w:rFonts w:hint="eastAsia"/>
+          <w:color w:val="000000"/>
+          <w:sz w:val="18"/>
+        </w:rPr>
+        <w:lastRenderedPageBreak/>
+        <w:t>了更具体的理解。作为项目经理，我在项目开始阶段负责制定项目计划，明确系统要实现的主要功能和成员分工，并要求开发过程中把接口变更、问题修复、测试结果写入开发日志，同时使用</w:t>
+      </w:r>
+      <w:r>
+        <w:rPr>
+          <w:rFonts w:hint="eastAsia"/>
+          <w:color w:val="000000"/>
+          <w:sz w:val="18"/>
+        </w:rPr>
+        <w:t xml:space="preserve"> Git </w:t>
+      </w:r>
+      <w:r>
+        <w:rPr>
+          <w:rFonts w:hint="eastAsia"/>
+          <w:color w:val="000000"/>
+          <w:sz w:val="18"/>
+        </w:rPr>
+        <w:t>对代码进行管理。这个过程让我认识到，团队开发不能只靠临时沟通，必须提前划清需求边界、接口边界和责任边界，否则后期很容易出现字段不一致、接口理解不同、重复开发等问题。</w:t>
+      </w:r>
     </w:p>
     <w:p>
       <w:pPr>
-        <w:rPr>
-          <w:rFonts w:hint="eastAsia"/>
+        <w:ind w:firstLine="21pt"/>
+        <w:rPr>
+          <w:color w:val="000000"/>
+          <w:sz w:val="18"/>
+        </w:rPr>
+      </w:pPr>
+      <w:r>
+        <w:rPr>
+          <w:rFonts w:hint="eastAsia"/>
+          <w:color w:val="000000"/>
+          <w:sz w:val="18"/>
+        </w:rPr>
+        <w:t>在具体开发中，我负责了用户模块后端接口的编写和测试，也参与了其他后端接口的联调和修改。项目后期，</w:t>
+      </w:r>
+      <w:r>
+        <w:rPr>
+          <w:rFonts w:hint="eastAsia"/>
+          <w:color w:val="000000"/>
+          <w:sz w:val="18"/>
+        </w:rPr>
+        <w:t xml:space="preserve">Android </w:t>
+      </w:r>
+      <w:r>
+        <w:rPr>
+          <w:rFonts w:hint="eastAsia"/>
+          <w:color w:val="000000"/>
+          <w:sz w:val="18"/>
+        </w:rPr>
+        <w:t>端除服务器部署外基本由我完成，包括项目结构搭建、</w:t>
+      </w:r>
+      <w:r>
+        <w:rPr>
+          <w:rFonts w:hint="eastAsia"/>
+          <w:color w:val="000000"/>
+          <w:sz w:val="18"/>
+        </w:rPr>
+        <w:t xml:space="preserve">Retrofit </w:t>
+      </w:r>
+      <w:r>
+        <w:rPr>
+          <w:rFonts w:hint="eastAsia"/>
+          <w:color w:val="000000"/>
+          <w:sz w:val="18"/>
+        </w:rPr>
+        <w:t>网络请求、登录注册、商品和猫咪浏览、购物车、下单、订单、点赞评论、个人资料以及轻量管理端等功能。</w:t>
+      </w:r>
+      <w:r>
+        <w:rPr>
+          <w:rFonts w:hint="eastAsia"/>
+          <w:color w:val="000000"/>
+          <w:sz w:val="18"/>
+        </w:rPr>
+        <w:t xml:space="preserve">Android </w:t>
+      </w:r>
+      <w:r>
+        <w:rPr>
+          <w:rFonts w:hint="eastAsia"/>
+          <w:color w:val="000000"/>
+          <w:sz w:val="18"/>
+        </w:rPr>
+        <w:t>开发对我来说是比较大的挑战，因为一开始对</w:t>
+      </w:r>
+      <w:r>
+        <w:rPr>
+          <w:rFonts w:hint="eastAsia"/>
+          <w:color w:val="000000"/>
+          <w:sz w:val="18"/>
+        </w:rPr>
+        <w:t xml:space="preserve"> Android </w:t>
+      </w:r>
+      <w:r>
+        <w:rPr>
+          <w:rFonts w:hint="eastAsia"/>
+          <w:color w:val="000000"/>
+          <w:sz w:val="18"/>
+        </w:rPr>
+        <w:t>页面开发、</w:t>
+      </w:r>
+      <w:r>
+        <w:rPr>
+          <w:rFonts w:hint="eastAsia"/>
+          <w:color w:val="000000"/>
+          <w:sz w:val="18"/>
+        </w:rPr>
+        <w:t>Activity/Fragment</w:t>
+      </w:r>
+      <w:r>
+        <w:rPr>
+          <w:rFonts w:hint="eastAsia"/>
+          <w:color w:val="000000"/>
+          <w:sz w:val="18"/>
+        </w:rPr>
+        <w:t>、</w:t>
+      </w:r>
+      <w:r>
+        <w:rPr>
+          <w:rFonts w:hint="eastAsia"/>
+          <w:color w:val="000000"/>
+          <w:sz w:val="18"/>
+        </w:rPr>
+        <w:t>RecyclerView</w:t>
+      </w:r>
+      <w:r>
+        <w:rPr>
+          <w:rFonts w:hint="eastAsia"/>
+          <w:color w:val="000000"/>
+          <w:sz w:val="18"/>
+        </w:rPr>
+        <w:t>、网络请求等都不熟悉，需要边查资料边实现，再和后端接口反复联调。这个过程提升了我快速学习新技术、定位问题和把功能完整落地的能力。</w:t>
+      </w:r>
+    </w:p>
+    <w:p>
+      <w:pPr>
+        <w:ind w:firstLine="21pt"/>
+        <w:rPr>
+          <w:color w:val="000000"/>
+          <w:sz w:val="18"/>
+        </w:rPr>
+      </w:pPr>
+      <w:r>
+        <w:rPr>
+          <w:rFonts w:hint="eastAsia"/>
+          <w:color w:val="000000"/>
+          <w:sz w:val="18"/>
+        </w:rPr>
+        <w:t>本项目也让我对系统架构有了更深的认识。项目中</w:t>
+      </w:r>
+      <w:r>
+        <w:rPr>
+          <w:rFonts w:hint="eastAsia"/>
+          <w:color w:val="000000"/>
+          <w:sz w:val="18"/>
+        </w:rPr>
+        <w:t xml:space="preserve"> Web </w:t>
+      </w:r>
+      <w:r>
+        <w:rPr>
+          <w:rFonts w:hint="eastAsia"/>
+          <w:color w:val="000000"/>
+          <w:sz w:val="18"/>
+        </w:rPr>
+        <w:t>前端和</w:t>
+      </w:r>
+      <w:r>
+        <w:rPr>
+          <w:rFonts w:hint="eastAsia"/>
+          <w:color w:val="000000"/>
+          <w:sz w:val="18"/>
+        </w:rPr>
+        <w:t xml:space="preserve"> Android </w:t>
+      </w:r>
+      <w:r>
+        <w:rPr>
+          <w:rFonts w:hint="eastAsia"/>
+          <w:color w:val="000000"/>
+          <w:sz w:val="18"/>
+        </w:rPr>
+        <w:t>客户端共用同一套</w:t>
+      </w:r>
+      <w:r>
+        <w:rPr>
+          <w:rFonts w:hint="eastAsia"/>
+          <w:color w:val="000000"/>
+          <w:sz w:val="18"/>
+        </w:rPr>
+        <w:t xml:space="preserve"> FastAPI </w:t>
+      </w:r>
+      <w:r>
+        <w:rPr>
+          <w:rFonts w:hint="eastAsia"/>
+          <w:color w:val="000000"/>
+          <w:sz w:val="18"/>
+        </w:rPr>
+        <w:t>后端接口，这是我在设计阶段提出并坚持的思路。这样做减少了重复接口开发，也保证了权限校验、订单库存、评论审核、点赞防重等业务规则在不同客户端保持一致。实际开发中我也参与了接口设计、代码合并、代码检查和报告撰写，逐渐意识到一个软件能否顺利完成，不只取决于代码写得多少，更取决于需求是否清楚、接口是否稳定、测试是否充分、文档是否能让后来的人看懂。</w:t>
+      </w:r>
+    </w:p>
+    <w:p>
+      <w:pPr>
+        <w:ind w:firstLine="21pt"/>
+        <w:rPr>
+          <w:color w:val="000000"/>
+          <w:sz w:val="18"/>
+        </w:rPr>
+      </w:pPr>
+      <w:r>
+        <w:rPr>
+          <w:rFonts w:hint="eastAsia"/>
+          <w:color w:val="000000"/>
+          <w:sz w:val="18"/>
+        </w:rPr>
+        <w:t>对我个人来说，收获最大的是团队协作能力的提升。以前个人写代码时，只要自己能跑通就可以；但团队项目中，每个人的修改都会影响别人。刚开始我会担心自己的代码被其他人改坏，也担心合并代码时产生冲突。后来通过</w:t>
+      </w:r>
+      <w:r>
+        <w:rPr>
+          <w:rFonts w:hint="eastAsia"/>
+          <w:color w:val="000000"/>
+          <w:sz w:val="18"/>
+        </w:rPr>
+        <w:t xml:space="preserve"> Git </w:t>
+      </w:r>
+      <w:r>
+        <w:rPr>
+          <w:rFonts w:hint="eastAsia"/>
+          <w:color w:val="000000"/>
+          <w:sz w:val="18"/>
+        </w:rPr>
+        <w:t>管理、开发日志记录、接口文档核对和分模块沟通，我逐渐理解团队开发需要信任和规范并重：既要相信成员能完成自己的部分，也要用清晰的文档、明确的接口和及时的测试来降低协作风险。这个项目让我认识到，软件开发不是单纯写代码，而是持续把需求、设计、实现和验证连接起来的过程。</w:t>
+      </w:r>
+    </w:p>
+    <w:p>
+      <w:pPr>
+        <w:rPr>
           <w:color w:val="000000"/>
           <w:sz w:val="18"/>
         </w:rPr>
@@ -5463,25 +5911,7 @@
     </w:p>
     <w:p>
       <w:pPr>
-        <w:pStyle w:val="30"/>
-        <w:rPr>
-          <w:rFonts w:hint="eastAsia"/>
-          <w:color w:val="000000"/>
-          <w:sz w:val="18"/>
-        </w:rPr>
-      </w:pPr>
-      <w:r>
-        <w:rPr>
-          <w:rFonts w:hint="eastAsia"/>
-          <w:color w:val="000000"/>
-        </w:rPr>
-        <w:t>提示：结项评审委员会和项目成员们共同总结经验教训，并以文档的形式保存下来，在机构内共享，使集体受益。</w:t>
-      </w:r>
-    </w:p>
-    <w:p>
-      <w:pPr>
-        <w:rPr>
-          <w:rFonts w:hint="eastAsia"/>
+        <w:rPr>
           <w:color w:val="000000"/>
           <w:sz w:val="18"/>
         </w:rPr>
@@ -5489,8 +5919,7 @@
     </w:p>
     <w:tbl>
       <w:tblPr>
-        <w:tblW w:w="0pt" w:type="auto"/>
-        <w:tblInd w:w="0pt" w:type="dxa"/>
+        <w:tblW w:w="0pt" w:type="dxa"/>
         <w:tblBorders>
           <w:top w:val="single" w:sz="4" w:space="0" w:color="auto"/>
           <w:start w:val="single" w:sz="4" w:space="0" w:color="auto"/>
@@ -5515,7 +5944,6 @@
             <w:pPr>
               <w:jc w:val="center"/>
               <w:rPr>
-                <w:rFonts w:hint="eastAsia"/>
                 <w:color w:val="000000"/>
                 <w:sz w:val="18"/>
               </w:rPr>
@@ -5539,7 +5967,6 @@
             <w:pPr>
               <w:jc w:val="center"/>
               <w:rPr>
-                <w:rFonts w:hint="eastAsia"/>
                 <w:color w:val="000000"/>
                 <w:sz w:val="18"/>
               </w:rPr>
@@ -5563,7 +5990,6 @@
           <w:p>
             <w:pPr>
               <w:rPr>
-                <w:rFonts w:hint="eastAsia"/>
                 <w:color w:val="000000"/>
                 <w:sz w:val="18"/>
               </w:rPr>
@@ -5585,7 +6011,6 @@
           <w:p>
             <w:pPr>
               <w:rPr>
-                <w:rFonts w:hint="eastAsia"/>
                 <w:color w:val="000000"/>
                 <w:sz w:val="18"/>
               </w:rPr>
@@ -5705,7 +6130,6 @@
           <w:p>
             <w:pPr>
               <w:rPr>
-                <w:rFonts w:hint="eastAsia"/>
                 <w:color w:val="000000"/>
                 <w:sz w:val="18"/>
               </w:rPr>
@@ -5727,7 +6151,6 @@
           <w:p>
             <w:pPr>
               <w:rPr>
-                <w:rFonts w:hint="eastAsia"/>
                 <w:color w:val="000000"/>
                 <w:sz w:val="18"/>
               </w:rPr>
@@ -5866,7 +6289,55 @@
                 <w:color w:val="000000"/>
                 <w:sz w:val="18"/>
               </w:rPr>
-              <w:t>。应从一开始就引导前端同学习惯查阅</w:t>
+              <w:t>。</w:t>
+            </w:r>
+            <w:r>
+              <w:rPr>
+                <w:rFonts w:hint="eastAsia"/>
+                <w:color w:val="000000"/>
+                <w:sz w:val="18"/>
+              </w:rPr>
+              <w:t xml:space="preserve">Android </w:t>
+            </w:r>
+            <w:r>
+              <w:rPr>
+                <w:rFonts w:hint="eastAsia"/>
+                <w:color w:val="000000"/>
+                <w:sz w:val="18"/>
+              </w:rPr>
+              <w:t>接入后也进一步证明，字段名、状态码、分页结构、批次订单结构等必须以</w:t>
+            </w:r>
+            <w:r>
+              <w:rPr>
+                <w:rFonts w:hint="eastAsia"/>
+                <w:color w:val="000000"/>
+                <w:sz w:val="18"/>
+              </w:rPr>
+              <w:t xml:space="preserve"> backend/schemas.py</w:t>
+            </w:r>
+            <w:r>
+              <w:rPr>
+                <w:rFonts w:hint="eastAsia"/>
+                <w:color w:val="000000"/>
+                <w:sz w:val="18"/>
+              </w:rPr>
+              <w:t>、</w:t>
+            </w:r>
+            <w:r>
+              <w:rPr>
+                <w:rFonts w:hint="eastAsia"/>
+                <w:color w:val="000000"/>
+                <w:sz w:val="18"/>
+              </w:rPr>
+              <w:t xml:space="preserve">backend/routers/ </w:t>
+            </w:r>
+            <w:r>
+              <w:rPr>
+                <w:rFonts w:hint="eastAsia"/>
+                <w:color w:val="000000"/>
+                <w:sz w:val="18"/>
+              </w:rPr>
+              <w:t>和</w:t>
             </w:r>
             <w:r>
               <w:rPr>
@@ -5882,7 +6353,7 @@
                 <w:color w:val="000000"/>
                 <w:sz w:val="18"/>
               </w:rPr>
-              <w:t>页面，减少沟通误差。</w:t>
+              <w:t>为准。后续应在每次接口变更后同步更新调用端模型，减少跨端联调成本。</w:t>
             </w:r>
           </w:p>
         </w:tc>
@@ -5895,7 +6366,6 @@
           <w:p>
             <w:pPr>
               <w:rPr>
-                <w:rFonts w:hint="eastAsia"/>
                 <w:color w:val="000000"/>
                 <w:sz w:val="18"/>
               </w:rPr>
@@ -5917,7 +6387,6 @@
           <w:p>
             <w:pPr>
               <w:rPr>
-                <w:rFonts w:hint="eastAsia"/>
                 <w:color w:val="000000"/>
                 <w:sz w:val="18"/>
               </w:rPr>
@@ -5928,39 +6397,39 @@
                 <w:color w:val="000000"/>
                 <w:sz w:val="18"/>
               </w:rPr>
-              <w:t>管理员后台接口不要等到最后集中补充。本项目最初按</w:t>
-            </w:r>
-            <w:r>
-              <w:rPr>
-                <w:rFonts w:hint="eastAsia"/>
-                <w:color w:val="000000"/>
-                <w:sz w:val="18"/>
-              </w:rPr>
-              <w:t>"</w:t>
-            </w:r>
-            <w:r>
-              <w:rPr>
-                <w:rFonts w:hint="eastAsia"/>
-                <w:color w:val="000000"/>
-                <w:sz w:val="18"/>
-              </w:rPr>
-              <w:t>用户端需要什么就写什么</w:t>
-            </w:r>
-            <w:r>
-              <w:rPr>
-                <w:rFonts w:hint="eastAsia"/>
-                <w:color w:val="000000"/>
-                <w:sz w:val="18"/>
-              </w:rPr>
-              <w:t>"</w:t>
-            </w:r>
-            <w:r>
-              <w:rPr>
-                <w:rFonts w:hint="eastAsia"/>
-                <w:color w:val="000000"/>
-                <w:sz w:val="18"/>
-              </w:rPr>
-              <w:t>的思路开发，后期发现管理员后台页面需要查看全量数据（含下架商品、休息中猫咪、待审</w:t>
+              <w:t>管理员视角的接口和页面应在设计阶段提前规划。本项目最初按“用户端需要什么就写什么”的思路推进，后期</w:t>
+            </w:r>
+            <w:r>
+              <w:rPr>
+                <w:rFonts w:hint="eastAsia"/>
+                <w:color w:val="000000"/>
+                <w:sz w:val="18"/>
+              </w:rPr>
+              <w:t xml:space="preserve"> Web </w:t>
+            </w:r>
+            <w:r>
+              <w:rPr>
+                <w:rFonts w:hint="eastAsia"/>
+                <w:color w:val="000000"/>
+                <w:sz w:val="18"/>
+              </w:rPr>
+              <w:t>管理后台和</w:t>
+            </w:r>
+            <w:r>
+              <w:rPr>
+                <w:rFonts w:hint="eastAsia"/>
+                <w:color w:val="000000"/>
+                <w:sz w:val="18"/>
+              </w:rPr>
+              <w:t xml:space="preserve">Android </w:t>
+            </w:r>
+            <w:r>
+              <w:rPr>
+                <w:rFonts w:hint="eastAsia"/>
+                <w:color w:val="000000"/>
+                <w:sz w:val="18"/>
+              </w:rPr>
+              <w:t>轻量管理端都需要查看全量数</w:t>
             </w:r>
             <w:r>
               <w:rPr>
@@ -5969,39 +6438,7 @@
                 <w:sz w:val="18"/>
               </w:rPr>
               <w:lastRenderedPageBreak/>
-              <w:t>核评论等），集中补充了</w:t>
-            </w:r>
-            <w:r>
-              <w:rPr>
-                <w:rFonts w:hint="eastAsia"/>
-                <w:color w:val="000000"/>
-                <w:sz w:val="18"/>
-              </w:rPr>
-              <w:t xml:space="preserve"> 8 </w:t>
-            </w:r>
-            <w:r>
-              <w:rPr>
-                <w:rFonts w:hint="eastAsia"/>
-                <w:color w:val="000000"/>
-                <w:sz w:val="18"/>
-              </w:rPr>
-              <w:t>个管理员专用接口。如果在设计阶段就规划完整的管理员视角</w:t>
-            </w:r>
-            <w:r>
-              <w:rPr>
-                <w:rFonts w:hint="eastAsia"/>
-                <w:color w:val="000000"/>
-                <w:sz w:val="18"/>
-              </w:rPr>
-              <w:t xml:space="preserve"> API</w:t>
-            </w:r>
-            <w:r>
-              <w:rPr>
-                <w:rFonts w:hint="eastAsia"/>
-                <w:color w:val="000000"/>
-                <w:sz w:val="18"/>
-              </w:rPr>
-              <w:t>，开发节奏会更均匀。</w:t>
+              <w:t>据、筛选不同状态、审核评论、处理订单、上传商品和猫咪图片，因此陆续补充了管理员列表、编辑、删除、审核、上传等接口。如果在系统设计阶段就完整梳理管理员工作流，接口数量、权限边界和页面节奏会更稳定。</w:t>
             </w:r>
           </w:p>
         </w:tc>
@@ -6014,7 +6451,6 @@
           <w:p>
             <w:pPr>
               <w:rPr>
-                <w:rFonts w:hint="eastAsia"/>
                 <w:color w:val="000000"/>
                 <w:sz w:val="18"/>
               </w:rPr>
@@ -6037,7 +6473,6 @@
           <w:p>
             <w:pPr>
               <w:rPr>
-                <w:rFonts w:hint="eastAsia"/>
                 <w:color w:val="000000"/>
                 <w:sz w:val="18"/>
               </w:rPr>
@@ -6141,7 +6576,6 @@
           <w:p>
             <w:pPr>
               <w:rPr>
-                <w:rFonts w:hint="eastAsia"/>
                 <w:color w:val="000000"/>
                 <w:sz w:val="18"/>
               </w:rPr>
@@ -6163,7 +6597,6 @@
           <w:p>
             <w:pPr>
               <w:rPr>
-                <w:rFonts w:hint="eastAsia"/>
                 <w:color w:val="000000"/>
                 <w:sz w:val="18"/>
               </w:rPr>
@@ -6272,7 +6705,6 @@
           <w:p>
             <w:pPr>
               <w:rPr>
-                <w:rFonts w:hint="eastAsia"/>
                 <w:color w:val="000000"/>
                 <w:sz w:val="18"/>
               </w:rPr>
@@ -6413,7 +6845,6 @@
           <w:p>
             <w:pPr>
               <w:rPr>
-                <w:rFonts w:hint="eastAsia"/>
                 <w:color w:val="000000"/>
                 <w:sz w:val="18"/>
               </w:rPr>
@@ -6509,7 +6940,6 @@
           <w:p>
             <w:pPr>
               <w:rPr>
-                <w:rFonts w:hint="eastAsia"/>
                 <w:color w:val="000000"/>
                 <w:sz w:val="18"/>
               </w:rPr>
@@ -6560,23 +6990,39 @@
                 <w:color w:val="000000"/>
                 <w:sz w:val="18"/>
               </w:rPr>
-              <w:t>是本项目的正确决策。避免了为不同客户端维护多套接口的重复工作，也保证了业务逻辑的一致性。后续类似项目应坚持</w:t>
-            </w:r>
-            <w:r>
-              <w:rPr>
-                <w:rFonts w:hint="eastAsia"/>
-                <w:color w:val="000000"/>
-                <w:sz w:val="18"/>
-              </w:rPr>
-              <w:t>"</w:t>
-            </w:r>
-            <w:r>
-              <w:rPr>
-                <w:rFonts w:hint="eastAsia"/>
-                <w:color w:val="000000"/>
-                <w:sz w:val="18"/>
-              </w:rPr>
-              <w:t>一套</w:t>
+              <w:t>是本项目的正确决策。这样避免了为不同客户端维护多套接口的重复工作，也保证了权限校验、库存扣减、评论审核、点赞防重等业务规则一致。但接口扩展时必须同步更新两端的数据模型和调用参数，例如评论个人列表、图片上传、点赞数统计、评论按点赞数排序等功能都需要</w:t>
+            </w:r>
+            <w:r>
+              <w:rPr>
+                <w:rFonts w:hint="eastAsia"/>
+                <w:color w:val="000000"/>
+                <w:sz w:val="18"/>
+              </w:rPr>
+              <w:t xml:space="preserve"> Web</w:t>
+            </w:r>
+            <w:r>
+              <w:rPr>
+                <w:rFonts w:hint="eastAsia"/>
+                <w:color w:val="000000"/>
+                <w:sz w:val="18"/>
+              </w:rPr>
+              <w:t>、</w:t>
+            </w:r>
+            <w:r>
+              <w:rPr>
+                <w:rFonts w:hint="eastAsia"/>
+                <w:color w:val="000000"/>
+                <w:sz w:val="18"/>
+              </w:rPr>
+              <w:t xml:space="preserve">Android </w:t>
+            </w:r>
+            <w:r>
+              <w:rPr>
+                <w:rFonts w:hint="eastAsia"/>
+                <w:color w:val="000000"/>
+                <w:sz w:val="18"/>
+              </w:rPr>
+              <w:t>与后端保持一致。后续类似项目应坚持“一套</w:t>
             </w:r>
             <w:r>
               <w:rPr>
@@ -6592,23 +7038,7 @@
                 <w:color w:val="000000"/>
                 <w:sz w:val="18"/>
               </w:rPr>
-              <w:t>服务多端</w:t>
-            </w:r>
-            <w:r>
-              <w:rPr>
-                <w:rFonts w:hint="eastAsia"/>
-                <w:color w:val="000000"/>
-                <w:sz w:val="18"/>
-              </w:rPr>
-              <w:t>"</w:t>
-            </w:r>
-            <w:r>
-              <w:rPr>
-                <w:rFonts w:hint="eastAsia"/>
-                <w:color w:val="000000"/>
-                <w:sz w:val="18"/>
-              </w:rPr>
-              <w:t>的架构原则。</w:t>
+              <w:t>服务多端”，同时建立接口变更同步清单。</w:t>
             </w:r>
           </w:p>
         </w:tc>
@@ -6642,7 +7072,6 @@
           <w:p>
             <w:pPr>
               <w:rPr>
-                <w:rFonts w:hint="eastAsia"/>
                 <w:color w:val="000000"/>
                 <w:sz w:val="18"/>
               </w:rPr>
@@ -6750,6 +7179,255 @@
                 <w:sz w:val="18"/>
               </w:rPr>
               <w:t>辅助模块规范化清理流程。教训：使用软引用的地方应在设计文档中标注，并在编码阶段就建立对应的清理机制，不要等到发现脏数据再修补。</w:t>
+            </w:r>
+          </w:p>
+        </w:tc>
+      </w:tr>
+      <w:tr>
+        <w:tc>
+          <w:tcPr>
+            <w:tcW w:w="61.40pt" w:type="dxa"/>
+          </w:tcPr>
+          <w:p>
+            <w:pPr>
+              <w:rPr>
+                <w:color w:val="000000"/>
+                <w:sz w:val="18"/>
+              </w:rPr>
+            </w:pPr>
+            <w:r>
+              <w:rPr>
+                <w:rFonts w:hint="eastAsia"/>
+                <w:color w:val="000000"/>
+                <w:sz w:val="18"/>
+              </w:rPr>
+              <w:t>10</w:t>
+            </w:r>
+          </w:p>
+        </w:tc>
+        <w:tc>
+          <w:tcPr>
+            <w:tcW w:w="374.60pt" w:type="dxa"/>
+          </w:tcPr>
+          <w:p>
+            <w:pPr>
+              <w:rPr>
+                <w:color w:val="000000"/>
+                <w:sz w:val="18"/>
+              </w:rPr>
+            </w:pPr>
+            <w:r>
+              <w:rPr>
+                <w:rFonts w:hint="eastAsia"/>
+                <w:color w:val="000000"/>
+                <w:sz w:val="18"/>
+              </w:rPr>
+              <w:t>结项阶段不能只按记忆写报告，必须回到真实代码、数据库脚本和开发日志逐项核对。本项目在开发后期同时存在后端、</w:t>
+            </w:r>
+            <w:r>
+              <w:rPr>
+                <w:rFonts w:hint="eastAsia"/>
+                <w:color w:val="000000"/>
+                <w:sz w:val="18"/>
+              </w:rPr>
+              <w:t>Web</w:t>
+            </w:r>
+            <w:r>
+              <w:rPr>
+                <w:rFonts w:hint="eastAsia"/>
+                <w:color w:val="000000"/>
+                <w:sz w:val="18"/>
+              </w:rPr>
+              <w:t>、</w:t>
+            </w:r>
+            <w:r>
+              <w:rPr>
+                <w:rFonts w:hint="eastAsia"/>
+                <w:color w:val="000000"/>
+                <w:sz w:val="18"/>
+              </w:rPr>
+              <w:t>Android</w:t>
+            </w:r>
+            <w:r>
+              <w:rPr>
+                <w:rFonts w:hint="eastAsia"/>
+                <w:color w:val="000000"/>
+                <w:sz w:val="18"/>
+              </w:rPr>
+              <w:t>、部署脚本和多份开发日志，部分早期文档中的接口数量、</w:t>
+            </w:r>
+            <w:r>
+              <w:rPr>
+                <w:rFonts w:hint="eastAsia"/>
+                <w:color w:val="000000"/>
+                <w:sz w:val="18"/>
+              </w:rPr>
+              <w:t xml:space="preserve">Android </w:t>
+            </w:r>
+            <w:r>
+              <w:rPr>
+                <w:rFonts w:hint="eastAsia"/>
+                <w:color w:val="000000"/>
+                <w:sz w:val="18"/>
+              </w:rPr>
+              <w:t>完成范围、测试状态已经被后续实现更新。如果结项报告直接沿用早期表述，容易把“阶段状态”误写成“最终成果”。后续项目应在结项前建立一份最终核对清单，以</w:t>
+            </w:r>
+            <w:r>
+              <w:rPr>
+                <w:rFonts w:hint="eastAsia"/>
+                <w:color w:val="000000"/>
+                <w:sz w:val="18"/>
+              </w:rPr>
+              <w:t>database/init.sql</w:t>
+            </w:r>
+            <w:r>
+              <w:rPr>
+                <w:rFonts w:hint="eastAsia"/>
+                <w:color w:val="000000"/>
+                <w:sz w:val="18"/>
+              </w:rPr>
+              <w:t>、</w:t>
+            </w:r>
+            <w:r>
+              <w:rPr>
+                <w:rFonts w:hint="eastAsia"/>
+                <w:color w:val="000000"/>
+                <w:sz w:val="18"/>
+              </w:rPr>
+              <w:t>backend/routers</w:t>
+            </w:r>
+            <w:r>
+              <w:rPr>
+                <w:rFonts w:hint="eastAsia"/>
+                <w:color w:val="000000"/>
+                <w:sz w:val="18"/>
+              </w:rPr>
+              <w:t>、</w:t>
+            </w:r>
+            <w:r>
+              <w:rPr>
+                <w:rFonts w:hint="eastAsia"/>
+                <w:color w:val="000000"/>
+                <w:sz w:val="18"/>
+              </w:rPr>
+              <w:t>backend/schemas.py</w:t>
+            </w:r>
+            <w:r>
+              <w:rPr>
+                <w:rFonts w:hint="eastAsia"/>
+                <w:color w:val="000000"/>
+                <w:sz w:val="18"/>
+              </w:rPr>
+              <w:t>、</w:t>
+            </w:r>
+            <w:r>
+              <w:rPr>
+                <w:rFonts w:hint="eastAsia"/>
+                <w:color w:val="000000"/>
+                <w:sz w:val="18"/>
+              </w:rPr>
+              <w:t xml:space="preserve">Android </w:t>
+            </w:r>
+            <w:r>
+              <w:rPr>
+                <w:rFonts w:hint="eastAsia"/>
+                <w:color w:val="000000"/>
+                <w:sz w:val="18"/>
+              </w:rPr>
+              <w:t>实际目录、</w:t>
+            </w:r>
+            <w:r>
+              <w:rPr>
+                <w:rFonts w:hint="eastAsia"/>
+                <w:color w:val="000000"/>
+                <w:sz w:val="18"/>
+              </w:rPr>
+              <w:t xml:space="preserve">Web </w:t>
+            </w:r>
+            <w:r>
+              <w:rPr>
+                <w:rFonts w:hint="eastAsia"/>
+                <w:color w:val="000000"/>
+                <w:sz w:val="18"/>
+              </w:rPr>
+              <w:t>路由和最新开发日志为依据，先确认事实，再撰写报告。</w:t>
+            </w:r>
+          </w:p>
+        </w:tc>
+      </w:tr>
+      <w:tr>
+        <w:tc>
+          <w:tcPr>
+            <w:tcW w:w="61.40pt" w:type="dxa"/>
+          </w:tcPr>
+          <w:p>
+            <w:pPr>
+              <w:rPr>
+                <w:color w:val="000000"/>
+                <w:sz w:val="18"/>
+              </w:rPr>
+            </w:pPr>
+            <w:r>
+              <w:rPr>
+                <w:rFonts w:hint="eastAsia"/>
+                <w:color w:val="000000"/>
+                <w:sz w:val="18"/>
+              </w:rPr>
+              <w:t>11</w:t>
+            </w:r>
+          </w:p>
+        </w:tc>
+        <w:tc>
+          <w:tcPr>
+            <w:tcW w:w="374.60pt" w:type="dxa"/>
+          </w:tcPr>
+          <w:p>
+            <w:pPr>
+              <w:rPr>
+                <w:color w:val="000000"/>
+                <w:sz w:val="18"/>
+              </w:rPr>
+            </w:pPr>
+            <w:r>
+              <w:rPr>
+                <w:rFonts w:hint="eastAsia"/>
+                <w:color w:val="000000"/>
+                <w:sz w:val="18"/>
+              </w:rPr>
+              <w:t>测试记录应区分“已验证主流程”和“未覆盖边界”，不要用“全部通过”概括所有情况。本项目核心业务流程已经完成验证，但仍存在</w:t>
+            </w:r>
+            <w:r>
+              <w:rPr>
+                <w:rFonts w:hint="eastAsia"/>
+                <w:color w:val="000000"/>
+                <w:sz w:val="18"/>
+              </w:rPr>
+              <w:t>t</w:t>
+            </w:r>
+            <w:r>
+              <w:rPr>
+                <w:rFonts w:hint="eastAsia"/>
+                <w:color w:val="000000"/>
+                <w:sz w:val="18"/>
+              </w:rPr>
+              <w:t xml:space="preserve">oken </w:t>
+            </w:r>
+            <w:r>
+              <w:rPr>
+                <w:rFonts w:hint="eastAsia"/>
+                <w:color w:val="000000"/>
+                <w:sz w:val="18"/>
+              </w:rPr>
+              <w:t>过期、个别状态数据详情查看等较少使用的边界场景需要单独构造数据才能测试。后续项目应把测试结论拆成主流程、异常分支、跨模块联动和未测风险四类记录，这样既能体现完成度，也能避</w:t>
+            </w:r>
+            <w:r>
+              <w:rPr>
+                <w:rFonts w:hint="eastAsia"/>
+                <w:color w:val="000000"/>
+                <w:sz w:val="18"/>
+              </w:rPr>
+              <w:lastRenderedPageBreak/>
+              <w:t>免在评审中被未验证细节反向质疑。</w:t>
             </w:r>
           </w:p>
         </w:tc>
@@ -6758,7 +7436,6 @@
     <w:p>
       <w:pPr>
         <w:rPr>
-          <w:rFonts w:hint="eastAsia"/>
           <w:color w:val="000000"/>
           <w:sz w:val="18"/>
         </w:rPr>
@@ -6800,8 +7477,7 @@
 <w:ftr xmlns:cx="http://schemas.microsoft.com/office/drawing/2014/chartex" xmlns:cx1="http://schemas.microsoft.com/office/drawing/2015/9/8/chartex" xmlns:cx2="http://schemas.microsoft.com/office/drawing/2015/10/21/chartex" xmlns:cx3="http://schemas.microsoft.com/office/drawing/2016/5/9/chartex" xmlns:cx4="http://schemas.microsoft.com/office/drawing/2016/5/10/chartex" xmlns:cx5="http://schemas.microsoft.com/office/drawing/2016/5/11/chartex" xmlns:cx6="http://schemas.microsoft.com/office/drawing/2016/5/12/chartex" xmlns:cx7="http://schemas.microsoft.com/office/drawing/2016/5/13/chartex" xmlns:cx8="http://schemas.microsoft.com/office/drawing/2016/5/14/chartex" xmlns:mc="http://schemas.openxmlformats.org/markup-compatibility/2006" xmlns:aink="http://schemas.microsoft.com/office/drawing/2016/ink" xmlns:am3d="http://schemas.microsoft.com/office/drawing/2017/model3d" xmlns:o="urn:schemas-microsoft-com:office:office" xmlns:oel="http://schemas.microsoft.com/office/2019/extlst" xmlns:r="http://purl.oclc.org/ooxml/officeDocument/relationships" xmlns:m="http://purl.oclc.org/ooxml/officeDocument/math" xmlns:v="urn:schemas-microsoft-com:vml" xmlns:wp14="http://schemas.microsoft.com/office/word/2010/wordprocessingDrawing" xmlns:wp="http://purl.oclc.org/ooxml/drawingml/wordprocessingDrawing" xmlns:w10="urn:schemas-microsoft-com:office:word" xmlns:w="http://purl.oclc.org/ooxml/wordprocessingml/main" xmlns:w14="http://schemas.microsoft.com/office/word/2010/wordml" xmlns:w15="http://schemas.microsoft.com/office/word/2012/wordml" xmlns:w16cex="http://schemas.microsoft.com/office/word/2018/wordml/cex" xmlns:w16cid="http://schemas.microsoft.com/office/word/2016/wordml/cid" xmlns:w16="http://schemas.microsoft.com/office/word/2018/wordml" xmlns:w16du="http://schemas.microsoft.com/office/word/2023/wordml/word16du" xmlns:w16sdtdh="http://schemas.microsoft.com/office/word/2020/wordml/sdtdatahash" xmlns:w16sdtfl="http://schemas.microsoft.com/office/word/2024/wordml/sdtformatlock" xmlns:w16se="http://schemas.microsoft.com/office/word/2015/wordml/symex" xmlns:wpi="http://schemas.microsoft.com/office/word/2010/wordprocessingInk" xmlns:wne="http://schemas.microsoft.com/office/word/2006/wordml" mc:Ignorable="w14 w15 w16se w16cid w16 w16cex w16sdtdh w16sdtfl w16du wne wp14">
   <w:tbl>
     <w:tblPr>
-      <w:tblW w:w="0pt" w:type="auto"/>
-      <w:tblInd w:w="0pt" w:type="dxa"/>
+      <w:tblW w:w="0pt" w:type="dxa"/>
       <w:tblLook w:firstRow="0" w:lastRow="0" w:firstColumn="0" w:lastColumn="0" w:noHBand="0" w:noVBand="0"/>
     </w:tblPr>
     <w:tblGrid>
@@ -6845,9 +7521,6 @@
           <w:pPr>
             <w:pStyle w:val="a6"/>
             <w:jc w:val="end"/>
-            <w:rPr>
-              <w:rFonts w:hint="eastAsia"/>
-            </w:rPr>
           </w:pPr>
           <w:r>
             <w:rPr>
@@ -6876,7 +7549,6 @@
           <w:r>
             <w:rPr>
               <w:rStyle w:val="a9"/>
-              <w:lang w:val="en-US" w:eastAsia="zh-CN"/>
             </w:rPr>
             <w:t>6</w:t>
           </w:r>
@@ -6913,7 +7585,6 @@
           <w:r>
             <w:rPr>
               <w:rStyle w:val="a9"/>
-              <w:lang w:val="en-US" w:eastAsia="zh-CN"/>
             </w:rPr>
             <w:t>6</w:t>
           </w:r>
@@ -6960,9 +7631,6 @@
     <w:pPr>
       <w:pStyle w:val="a7"/>
       <w:jc w:val="both"/>
-      <w:rPr>
-        <w:rFonts w:hint="eastAsia"/>
-      </w:rPr>
     </w:pPr>
     <w:r>
       <w:rPr>
@@ -7090,7 +7758,7 @@
     <w:lsdException w:name="HTML Sample" w:semiHidden="1" w:unhideWhenUsed="1"/>
     <w:lsdException w:name="HTML Typewriter" w:semiHidden="1" w:unhideWhenUsed="1"/>
     <w:lsdException w:name="HTML Variable" w:semiHidden="1" w:unhideWhenUsed="1"/>
-    <w:lsdException w:name="Normal Table" w:unhideWhenUsed="1"/>
+    <w:lsdException w:name="Normal Table" w:semiHidden="1" w:unhideWhenUsed="1"/>
     <w:lsdException w:name="annotation subject" w:semiHidden="1" w:unhideWhenUsed="1"/>
     <w:lsdException w:name="No List" w:semiHidden="1" w:unhideWhenUsed="1"/>
     <w:lsdException w:name="Outline List 1" w:semiHidden="1" w:unhideWhenUsed="1"/>
@@ -7446,13 +8114,17 @@
   </w:style>
   <w:style w:type="character" w:default="1" w:styleId="a0">
     <w:name w:val="Default Paragraph Font"/>
+    <w:uiPriority w:val="1"/>
     <w:semiHidden/>
+    <w:unhideWhenUsed/>
   </w:style>
   <w:style w:type="table" w:default="1" w:styleId="a1">
     <w:name w:val="Normal Table"/>
     <w:uiPriority w:val="99"/>
+    <w:semiHidden/>
     <w:unhideWhenUsed/>
     <w:tblPr>
+      <w:tblInd w:w="0pt" w:type="dxa"/>
       <w:tblCellMar>
         <w:top w:w="0pt" w:type="dxa"/>
         <w:start w:w="5.40pt" w:type="dxa"/>

</xml_diff>